<commit_message>
feat(export): Word con el diferencial (rigor, competidores, fuentes, exactitud, escenarios, seguimiento)
DocxExporter/PdfExporter aceptan `diferencial` (DatosDiferencial.del_estado) y
GET /studies/{id}/export lo pasa desde el estado. 13 secciones; rotulo
«Caso sintetico del reto» en estudios kit; ejemplo regenerado.

Co-Authored-By: Claude Opus 5.5 <noreply@anthropic.com>
</commit_message>
<xml_diff>
--- a/src/posiq/adapters/export/templates/propuesta.docx
+++ b/src/posiq/adapters/export/templates/propuesta.docx
@@ -22,13 +22,18 @@
     </w:p>
     <w:p>
       <w:r>
-        <w:t>{%p if aviso_sintetico %}</w:t>
+        <w:t>{%p if rotulo_sintetico %}</w:t>
       </w:r>
     </w:p>
     <w:p>
       <w:pPr>
         <w:pStyle w:val="IntenseQuote"/>
       </w:pPr>
+      <w:r>
+        <w:t>{{ rotulo_sintetico }}</w:t>
+      </w:r>
+    </w:p>
+    <w:p>
       <w:r>
         <w:t>{{ aviso_sintetico }}</w:t>
       </w:r>
@@ -2230,6 +2235,321 @@
     <w:p/>
     <w:p>
       <w:pPr>
+        <w:pStyle w:val="Heading2"/>
+      </w:pPr>
+      <w:r>
+        <w:t>Margen de error de las cifras</w:t>
+      </w:r>
+    </w:p>
+    <w:p>
+      <w:r>
+        <w:t>{%p if rigor.hay %}</w:t>
+      </w:r>
+    </w:p>
+    <w:p>
+      <w:r>
+        <w:t>{{ rigor.intro }}</w:t>
+      </w:r>
+    </w:p>
+    <w:tbl>
+      <w:tblPr>
+        <w:tblStyle w:val="LightList-Accent1"/>
+        <w:tblW w:type="auto" w:w="0"/>
+        <w:tblLook w:firstColumn="1" w:firstRow="1" w:lastColumn="0" w:lastRow="0" w:noHBand="0" w:noVBand="1" w:val="04A0"/>
+      </w:tblPr>
+      <w:tblGrid>
+        <w:gridCol w:w="4320"/>
+        <w:gridCol w:w="4320"/>
+      </w:tblGrid>
+      <w:tr>
+        <w:tc>
+          <w:tcPr>
+            <w:tcW w:type="dxa" w:w="4320"/>
+          </w:tcPr>
+          <w:p>
+            <w:r>
+              <w:t>Score de Citación [IC 95 %]</w:t>
+            </w:r>
+          </w:p>
+        </w:tc>
+        <w:tc>
+          <w:tcPr>
+            <w:tcW w:type="dxa" w:w="4320"/>
+          </w:tcPr>
+          <w:p>
+            <w:r>
+              <w:t>{{ rigor.score }}</w:t>
+            </w:r>
+          </w:p>
+        </w:tc>
+      </w:tr>
+      <w:tr>
+        <w:tc>
+          <w:tcPr>
+            <w:tcW w:type="dxa" w:w="4320"/>
+          </w:tcPr>
+          <w:p>
+            <w:r>
+              <w:t>Margen</w:t>
+            </w:r>
+          </w:p>
+        </w:tc>
+        <w:tc>
+          <w:tcPr>
+            <w:tcW w:type="dxa" w:w="4320"/>
+          </w:tcPr>
+          <w:p>
+            <w:r>
+              <w:t>{{ rigor.margen }}</w:t>
+            </w:r>
+          </w:p>
+        </w:tc>
+      </w:tr>
+      <w:tr>
+        <w:tc>
+          <w:tcPr>
+            <w:tcW w:type="dxa" w:w="4320"/>
+          </w:tcPr>
+          <w:p>
+            <w:r>
+              <w:t>Evaluaciones</w:t>
+            </w:r>
+          </w:p>
+        </w:tc>
+        <w:tc>
+          <w:tcPr>
+            <w:tcW w:type="dxa" w:w="4320"/>
+          </w:tcPr>
+          <w:p>
+            <w:r>
+              <w:t>{{ rigor.n }}</w:t>
+            </w:r>
+          </w:p>
+        </w:tc>
+      </w:tr>
+    </w:tbl>
+    <w:p/>
+    <w:p>
+      <w:pPr>
+        <w:pStyle w:val="Heading3"/>
+      </w:pPr>
+      <w:r>
+        <w:t>Aparición espontánea por motor, con su margen</w:t>
+      </w:r>
+    </w:p>
+    <w:tbl>
+      <w:tblPr>
+        <w:tblStyle w:val="LightGrid-Accent1"/>
+        <w:tblW w:type="auto" w:w="0"/>
+        <w:tblLook w:firstColumn="1" w:firstRow="1" w:lastColumn="0" w:lastRow="0" w:noHBand="0" w:noVBand="1" w:val="04A0"/>
+      </w:tblPr>
+      <w:tblGrid>
+        <w:gridCol w:w="1728"/>
+        <w:gridCol w:w="1728"/>
+        <w:gridCol w:w="1728"/>
+        <w:gridCol w:w="1728"/>
+        <w:gridCol w:w="1728"/>
+      </w:tblGrid>
+      <w:tr>
+        <w:tc>
+          <w:tcPr>
+            <w:tcW w:type="dxa" w:w="1728"/>
+          </w:tcPr>
+          <w:p>
+            <w:r>
+              <w:t>Motor</w:t>
+            </w:r>
+          </w:p>
+        </w:tc>
+        <w:tc>
+          <w:tcPr>
+            <w:tcW w:type="dxa" w:w="1728"/>
+          </w:tcPr>
+          <w:p>
+            <w:r>
+              <w:t>Aparición [IC 95 %]</w:t>
+            </w:r>
+          </w:p>
+        </w:tc>
+        <w:tc>
+          <w:tcPr>
+            <w:tcW w:type="dxa" w:w="1728"/>
+          </w:tcPr>
+          <w:p>
+            <w:r>
+              <w:t>Margen</w:t>
+            </w:r>
+          </w:p>
+        </w:tc>
+        <w:tc>
+          <w:tcPr>
+            <w:tcW w:type="dxa" w:w="1728"/>
+          </w:tcPr>
+          <w:p>
+            <w:r>
+              <w:t>Respuestas</w:t>
+            </w:r>
+          </w:p>
+        </w:tc>
+        <w:tc>
+          <w:tcPr>
+            <w:tcW w:type="dxa" w:w="1728"/>
+          </w:tcPr>
+          <w:p>
+            <w:r>
+              <w:t>Score del motor [IC 95 %]</w:t>
+            </w:r>
+          </w:p>
+        </w:tc>
+      </w:tr>
+      <w:tr>
+        <w:tc>
+          <w:tcPr>
+            <w:tcW w:type="dxa" w:w="1728"/>
+          </w:tcPr>
+          <w:p>
+            <w:r>
+              <w:t>{%tr for r in rigor.motores %}</w:t>
+            </w:r>
+          </w:p>
+        </w:tc>
+        <w:tc>
+          <w:tcPr>
+            <w:tcW w:type="dxa" w:w="1728"/>
+          </w:tcPr>
+          <w:p/>
+        </w:tc>
+        <w:tc>
+          <w:tcPr>
+            <w:tcW w:type="dxa" w:w="1728"/>
+          </w:tcPr>
+          <w:p/>
+        </w:tc>
+        <w:tc>
+          <w:tcPr>
+            <w:tcW w:type="dxa" w:w="1728"/>
+          </w:tcPr>
+          <w:p/>
+        </w:tc>
+        <w:tc>
+          <w:tcPr>
+            <w:tcW w:type="dxa" w:w="1728"/>
+          </w:tcPr>
+          <w:p/>
+        </w:tc>
+      </w:tr>
+      <w:tr>
+        <w:tc>
+          <w:tcPr>
+            <w:tcW w:type="dxa" w:w="1728"/>
+          </w:tcPr>
+          <w:p>
+            <w:r>
+              <w:t>{{ r.motor }}</w:t>
+            </w:r>
+          </w:p>
+        </w:tc>
+        <w:tc>
+          <w:tcPr>
+            <w:tcW w:type="dxa" w:w="1728"/>
+          </w:tcPr>
+          <w:p>
+            <w:r>
+              <w:t>{{ r.aparicion }}</w:t>
+            </w:r>
+          </w:p>
+        </w:tc>
+        <w:tc>
+          <w:tcPr>
+            <w:tcW w:type="dxa" w:w="1728"/>
+          </w:tcPr>
+          <w:p>
+            <w:r>
+              <w:t>{{ r.margen }}</w:t>
+            </w:r>
+          </w:p>
+        </w:tc>
+        <w:tc>
+          <w:tcPr>
+            <w:tcW w:type="dxa" w:w="1728"/>
+          </w:tcPr>
+          <w:p>
+            <w:r>
+              <w:t>{{ r.n }}</w:t>
+            </w:r>
+          </w:p>
+        </w:tc>
+        <w:tc>
+          <w:tcPr>
+            <w:tcW w:type="dxa" w:w="1728"/>
+          </w:tcPr>
+          <w:p>
+            <w:r>
+              <w:t>{{ r.score }}</w:t>
+            </w:r>
+          </w:p>
+        </w:tc>
+      </w:tr>
+      <w:tr>
+        <w:tc>
+          <w:tcPr>
+            <w:tcW w:type="dxa" w:w="1728"/>
+          </w:tcPr>
+          <w:p>
+            <w:r>
+              <w:t>{%tr endfor %}</w:t>
+            </w:r>
+          </w:p>
+        </w:tc>
+        <w:tc>
+          <w:tcPr>
+            <w:tcW w:type="dxa" w:w="1728"/>
+          </w:tcPr>
+          <w:p/>
+        </w:tc>
+        <w:tc>
+          <w:tcPr>
+            <w:tcW w:type="dxa" w:w="1728"/>
+          </w:tcPr>
+          <w:p/>
+        </w:tc>
+        <w:tc>
+          <w:tcPr>
+            <w:tcW w:type="dxa" w:w="1728"/>
+          </w:tcPr>
+          <w:p/>
+        </w:tc>
+        <w:tc>
+          <w:tcPr>
+            <w:tcW w:type="dxa" w:w="1728"/>
+          </w:tcPr>
+          <w:p/>
+        </w:tc>
+      </w:tr>
+    </w:tbl>
+    <w:p/>
+    <w:p>
+      <w:r>
+        <w:t>{{ rigor.metodo }}</w:t>
+      </w:r>
+    </w:p>
+    <w:p>
+      <w:r>
+        <w:t>{%p else %}</w:t>
+      </w:r>
+    </w:p>
+    <w:p>
+      <w:r>
+        <w:t>{{ rigor.aviso }}</w:t>
+      </w:r>
+    </w:p>
+    <w:p>
+      <w:r>
+        <w:t>{%p endif %}</w:t>
+      </w:r>
+    </w:p>
+    <w:p>
+      <w:pPr>
         <w:pStyle w:val="Heading1"/>
       </w:pPr>
       <w:r>
@@ -2651,6 +2971,836 @@
     <w:p/>
     <w:p>
       <w:pPr>
+        <w:pStyle w:val="Heading2"/>
+      </w:pPr>
+      <w:r>
+        <w:t>Competidores declarados frente a los que pone la IA</w:t>
+      </w:r>
+    </w:p>
+    <w:p>
+      <w:r>
+        <w:t>{%p if rivales.hay %}</w:t>
+      </w:r>
+    </w:p>
+    <w:p>
+      <w:r>
+        <w:t>{{ rivales.intro }}</w:t>
+      </w:r>
+    </w:p>
+    <w:p>
+      <w:r>
+        <w:t>{{ rivales.foco }}</w:t>
+      </w:r>
+    </w:p>
+    <w:p>
+      <w:pPr>
+        <w:pStyle w:val="Heading3"/>
+      </w:pPr>
+      <w:r>
+        <w:t>Los que declara el brief</w:t>
+      </w:r>
+    </w:p>
+    <w:tbl>
+      <w:tblPr>
+        <w:tblStyle w:val="LightGrid-Accent1"/>
+        <w:tblW w:type="auto" w:w="0"/>
+        <w:tblLook w:firstColumn="1" w:firstRow="1" w:lastColumn="0" w:lastRow="0" w:noHBand="0" w:noVBand="1" w:val="04A0"/>
+      </w:tblPr>
+      <w:tblGrid>
+        <w:gridCol w:w="1440"/>
+        <w:gridCol w:w="1440"/>
+        <w:gridCol w:w="1440"/>
+        <w:gridCol w:w="1440"/>
+        <w:gridCol w:w="1440"/>
+        <w:gridCol w:w="1440"/>
+      </w:tblGrid>
+      <w:tr>
+        <w:tc>
+          <w:tcPr>
+            <w:tcW w:type="dxa" w:w="1440"/>
+          </w:tcPr>
+          <w:p>
+            <w:r>
+              <w:t>Marca</w:t>
+            </w:r>
+          </w:p>
+        </w:tc>
+        <w:tc>
+          <w:tcPr>
+            <w:tcW w:type="dxa" w:w="1440"/>
+          </w:tcPr>
+          <w:p>
+            <w:r>
+              <w:t>Posición</w:t>
+            </w:r>
+          </w:p>
+        </w:tc>
+        <w:tc>
+          <w:tcPr>
+            <w:tcW w:type="dxa" w:w="1440"/>
+          </w:tcPr>
+          <w:p>
+            <w:r>
+              <w:t>Score</w:t>
+            </w:r>
+          </w:p>
+        </w:tc>
+        <w:tc>
+          <w:tcPr>
+            <w:tcW w:type="dxa" w:w="1440"/>
+          </w:tcPr>
+          <w:p>
+            <w:r>
+              <w:t>Ventaja sobre la marca</w:t>
+            </w:r>
+          </w:p>
+        </w:tc>
+        <w:tc>
+          <w:tcPr>
+            <w:tcW w:type="dxa" w:w="1440"/>
+          </w:tcPr>
+          <w:p>
+            <w:r>
+              <w:t>Visib. espontánea</w:t>
+            </w:r>
+          </w:p>
+        </w:tc>
+        <w:tc>
+          <w:tcPr>
+            <w:tcW w:type="dxa" w:w="1440"/>
+          </w:tcPr>
+          <w:p>
+            <w:r>
+              <w:t>Nota</w:t>
+            </w:r>
+          </w:p>
+        </w:tc>
+      </w:tr>
+      <w:tr>
+        <w:tc>
+          <w:tcPr>
+            <w:tcW w:type="dxa" w:w="1440"/>
+          </w:tcPr>
+          <w:p>
+            <w:r>
+              <w:t>{%tr for r in rivales.declarados %}</w:t>
+            </w:r>
+          </w:p>
+        </w:tc>
+        <w:tc>
+          <w:tcPr>
+            <w:tcW w:type="dxa" w:w="1440"/>
+          </w:tcPr>
+          <w:p/>
+        </w:tc>
+        <w:tc>
+          <w:tcPr>
+            <w:tcW w:type="dxa" w:w="1440"/>
+          </w:tcPr>
+          <w:p/>
+        </w:tc>
+        <w:tc>
+          <w:tcPr>
+            <w:tcW w:type="dxa" w:w="1440"/>
+          </w:tcPr>
+          <w:p/>
+        </w:tc>
+        <w:tc>
+          <w:tcPr>
+            <w:tcW w:type="dxa" w:w="1440"/>
+          </w:tcPr>
+          <w:p/>
+        </w:tc>
+        <w:tc>
+          <w:tcPr>
+            <w:tcW w:type="dxa" w:w="1440"/>
+          </w:tcPr>
+          <w:p/>
+        </w:tc>
+      </w:tr>
+      <w:tr>
+        <w:tc>
+          <w:tcPr>
+            <w:tcW w:type="dxa" w:w="1440"/>
+          </w:tcPr>
+          <w:p>
+            <w:r>
+              <w:t>{{ r.marca }}</w:t>
+            </w:r>
+          </w:p>
+        </w:tc>
+        <w:tc>
+          <w:tcPr>
+            <w:tcW w:type="dxa" w:w="1440"/>
+          </w:tcPr>
+          <w:p>
+            <w:r>
+              <w:t>{{ r.puesto }}</w:t>
+            </w:r>
+          </w:p>
+        </w:tc>
+        <w:tc>
+          <w:tcPr>
+            <w:tcW w:type="dxa" w:w="1440"/>
+          </w:tcPr>
+          <w:p>
+            <w:r>
+              <w:t>{{ r.score }}</w:t>
+            </w:r>
+          </w:p>
+        </w:tc>
+        <w:tc>
+          <w:tcPr>
+            <w:tcW w:type="dxa" w:w="1440"/>
+          </w:tcPr>
+          <w:p>
+            <w:r>
+              <w:t>{{ r.ventaja }}</w:t>
+            </w:r>
+          </w:p>
+        </w:tc>
+        <w:tc>
+          <w:tcPr>
+            <w:tcW w:type="dxa" w:w="1440"/>
+          </w:tcPr>
+          <w:p>
+            <w:r>
+              <w:t>{{ r.tasa }}</w:t>
+            </w:r>
+          </w:p>
+        </w:tc>
+        <w:tc>
+          <w:tcPr>
+            <w:tcW w:type="dxa" w:w="1440"/>
+          </w:tcPr>
+          <w:p>
+            <w:r>
+              <w:t>{{ r.nota }}</w:t>
+            </w:r>
+          </w:p>
+        </w:tc>
+      </w:tr>
+      <w:tr>
+        <w:tc>
+          <w:tcPr>
+            <w:tcW w:type="dxa" w:w="1440"/>
+          </w:tcPr>
+          <w:p>
+            <w:r>
+              <w:t>{%tr endfor %}</w:t>
+            </w:r>
+          </w:p>
+        </w:tc>
+        <w:tc>
+          <w:tcPr>
+            <w:tcW w:type="dxa" w:w="1440"/>
+          </w:tcPr>
+          <w:p/>
+        </w:tc>
+        <w:tc>
+          <w:tcPr>
+            <w:tcW w:type="dxa" w:w="1440"/>
+          </w:tcPr>
+          <w:p/>
+        </w:tc>
+        <w:tc>
+          <w:tcPr>
+            <w:tcW w:type="dxa" w:w="1440"/>
+          </w:tcPr>
+          <w:p/>
+        </w:tc>
+        <w:tc>
+          <w:tcPr>
+            <w:tcW w:type="dxa" w:w="1440"/>
+          </w:tcPr>
+          <w:p/>
+        </w:tc>
+        <w:tc>
+          <w:tcPr>
+            <w:tcW w:type="dxa" w:w="1440"/>
+          </w:tcPr>
+          <w:p/>
+        </w:tc>
+      </w:tr>
+    </w:tbl>
+    <w:p/>
+    <w:p>
+      <w:pPr>
+        <w:pStyle w:val="Heading3"/>
+      </w:pPr>
+      <w:r>
+        <w:t>Los que la IA pone por delante y el brief no declara</w:t>
+      </w:r>
+    </w:p>
+    <w:tbl>
+      <w:tblPr>
+        <w:tblStyle w:val="LightGrid-Accent1"/>
+        <w:tblW w:type="auto" w:w="0"/>
+        <w:tblLook w:firstColumn="1" w:firstRow="1" w:lastColumn="0" w:lastRow="0" w:noHBand="0" w:noVBand="1" w:val="04A0"/>
+      </w:tblPr>
+      <w:tblGrid>
+        <w:gridCol w:w="1440"/>
+        <w:gridCol w:w="1440"/>
+        <w:gridCol w:w="1440"/>
+        <w:gridCol w:w="1440"/>
+        <w:gridCol w:w="1440"/>
+        <w:gridCol w:w="1440"/>
+      </w:tblGrid>
+      <w:tr>
+        <w:tc>
+          <w:tcPr>
+            <w:tcW w:type="dxa" w:w="1440"/>
+          </w:tcPr>
+          <w:p>
+            <w:r>
+              <w:t>Marca</w:t>
+            </w:r>
+          </w:p>
+        </w:tc>
+        <w:tc>
+          <w:tcPr>
+            <w:tcW w:type="dxa" w:w="1440"/>
+          </w:tcPr>
+          <w:p>
+            <w:r>
+              <w:t>Posición</w:t>
+            </w:r>
+          </w:p>
+        </w:tc>
+        <w:tc>
+          <w:tcPr>
+            <w:tcW w:type="dxa" w:w="1440"/>
+          </w:tcPr>
+          <w:p>
+            <w:r>
+              <w:t>Score</w:t>
+            </w:r>
+          </w:p>
+        </w:tc>
+        <w:tc>
+          <w:tcPr>
+            <w:tcW w:type="dxa" w:w="1440"/>
+          </w:tcPr>
+          <w:p>
+            <w:r>
+              <w:t>Ventaja sobre la marca</w:t>
+            </w:r>
+          </w:p>
+        </w:tc>
+        <w:tc>
+          <w:tcPr>
+            <w:tcW w:type="dxa" w:w="1440"/>
+          </w:tcPr>
+          <w:p>
+            <w:r>
+              <w:t>Visib. espontánea</w:t>
+            </w:r>
+          </w:p>
+        </w:tc>
+        <w:tc>
+          <w:tcPr>
+            <w:tcW w:type="dxa" w:w="1440"/>
+          </w:tcPr>
+          <w:p>
+            <w:r>
+              <w:t>Nota</w:t>
+            </w:r>
+          </w:p>
+        </w:tc>
+      </w:tr>
+      <w:tr>
+        <w:tc>
+          <w:tcPr>
+            <w:tcW w:type="dxa" w:w="1440"/>
+          </w:tcPr>
+          <w:p>
+            <w:r>
+              <w:t>{%tr for r in rivales.por_delante %}</w:t>
+            </w:r>
+          </w:p>
+        </w:tc>
+        <w:tc>
+          <w:tcPr>
+            <w:tcW w:type="dxa" w:w="1440"/>
+          </w:tcPr>
+          <w:p/>
+        </w:tc>
+        <w:tc>
+          <w:tcPr>
+            <w:tcW w:type="dxa" w:w="1440"/>
+          </w:tcPr>
+          <w:p/>
+        </w:tc>
+        <w:tc>
+          <w:tcPr>
+            <w:tcW w:type="dxa" w:w="1440"/>
+          </w:tcPr>
+          <w:p/>
+        </w:tc>
+        <w:tc>
+          <w:tcPr>
+            <w:tcW w:type="dxa" w:w="1440"/>
+          </w:tcPr>
+          <w:p/>
+        </w:tc>
+        <w:tc>
+          <w:tcPr>
+            <w:tcW w:type="dxa" w:w="1440"/>
+          </w:tcPr>
+          <w:p/>
+        </w:tc>
+      </w:tr>
+      <w:tr>
+        <w:tc>
+          <w:tcPr>
+            <w:tcW w:type="dxa" w:w="1440"/>
+          </w:tcPr>
+          <w:p>
+            <w:r>
+              <w:t>{{ r.marca }}</w:t>
+            </w:r>
+          </w:p>
+        </w:tc>
+        <w:tc>
+          <w:tcPr>
+            <w:tcW w:type="dxa" w:w="1440"/>
+          </w:tcPr>
+          <w:p>
+            <w:r>
+              <w:t>{{ r.puesto }}</w:t>
+            </w:r>
+          </w:p>
+        </w:tc>
+        <w:tc>
+          <w:tcPr>
+            <w:tcW w:type="dxa" w:w="1440"/>
+          </w:tcPr>
+          <w:p>
+            <w:r>
+              <w:t>{{ r.score }}</w:t>
+            </w:r>
+          </w:p>
+        </w:tc>
+        <w:tc>
+          <w:tcPr>
+            <w:tcW w:type="dxa" w:w="1440"/>
+          </w:tcPr>
+          <w:p>
+            <w:r>
+              <w:t>{{ r.ventaja }}</w:t>
+            </w:r>
+          </w:p>
+        </w:tc>
+        <w:tc>
+          <w:tcPr>
+            <w:tcW w:type="dxa" w:w="1440"/>
+          </w:tcPr>
+          <w:p>
+            <w:r>
+              <w:t>{{ r.tasa }}</w:t>
+            </w:r>
+          </w:p>
+        </w:tc>
+        <w:tc>
+          <w:tcPr>
+            <w:tcW w:type="dxa" w:w="1440"/>
+          </w:tcPr>
+          <w:p>
+            <w:r>
+              <w:t>{{ r.nota }}</w:t>
+            </w:r>
+          </w:p>
+        </w:tc>
+      </w:tr>
+      <w:tr>
+        <w:tc>
+          <w:tcPr>
+            <w:tcW w:type="dxa" w:w="1440"/>
+          </w:tcPr>
+          <w:p>
+            <w:r>
+              <w:t>{%tr endfor %}</w:t>
+            </w:r>
+          </w:p>
+        </w:tc>
+        <w:tc>
+          <w:tcPr>
+            <w:tcW w:type="dxa" w:w="1440"/>
+          </w:tcPr>
+          <w:p/>
+        </w:tc>
+        <w:tc>
+          <w:tcPr>
+            <w:tcW w:type="dxa" w:w="1440"/>
+          </w:tcPr>
+          <w:p/>
+        </w:tc>
+        <w:tc>
+          <w:tcPr>
+            <w:tcW w:type="dxa" w:w="1440"/>
+          </w:tcPr>
+          <w:p/>
+        </w:tc>
+        <w:tc>
+          <w:tcPr>
+            <w:tcW w:type="dxa" w:w="1440"/>
+          </w:tcPr>
+          <w:p/>
+        </w:tc>
+        <w:tc>
+          <w:tcPr>
+            <w:tcW w:type="dxa" w:w="1440"/>
+          </w:tcPr>
+          <w:p/>
+        </w:tc>
+      </w:tr>
+    </w:tbl>
+    <w:p/>
+    <w:p>
+      <w:r>
+        <w:t>{{ rivales.umbral }}</w:t>
+      </w:r>
+    </w:p>
+    <w:p>
+      <w:r>
+        <w:t>{%p for item in rivales.notas %}</w:t>
+      </w:r>
+    </w:p>
+    <w:p>
+      <w:pPr>
+        <w:pStyle w:val="ListBullet"/>
+      </w:pPr>
+      <w:r>
+        <w:t>{{ item }}</w:t>
+      </w:r>
+    </w:p>
+    <w:p>
+      <w:r>
+        <w:t>{%p endfor %}</w:t>
+      </w:r>
+    </w:p>
+    <w:p>
+      <w:r>
+        <w:t>{%p else %}</w:t>
+      </w:r>
+    </w:p>
+    <w:p>
+      <w:r>
+        <w:t>{{ rivales.aviso }}</w:t>
+      </w:r>
+    </w:p>
+    <w:p>
+      <w:r>
+        <w:t>{%p endif %}</w:t>
+      </w:r>
+    </w:p>
+    <w:p>
+      <w:pPr>
+        <w:pStyle w:val="Heading2"/>
+      </w:pPr>
+      <w:r>
+        <w:t>Mapa de fuentes y oportunidades</w:t>
+      </w:r>
+    </w:p>
+    <w:p>
+      <w:r>
+        <w:t>{%p if fuentes_op.hay %}</w:t>
+      </w:r>
+    </w:p>
+    <w:p>
+      <w:r>
+        <w:t>{{ fuentes_op.intro }}</w:t>
+      </w:r>
+    </w:p>
+    <w:tbl>
+      <w:tblPr>
+        <w:tblStyle w:val="LightGrid-Accent1"/>
+        <w:tblW w:type="auto" w:w="0"/>
+        <w:tblLook w:firstColumn="1" w:firstRow="1" w:lastColumn="0" w:lastRow="0" w:noHBand="0" w:noVBand="1" w:val="04A0"/>
+      </w:tblPr>
+      <w:tblGrid>
+        <w:gridCol w:w="1234"/>
+        <w:gridCol w:w="1234"/>
+        <w:gridCol w:w="1234"/>
+        <w:gridCol w:w="1234"/>
+        <w:gridCol w:w="1234"/>
+        <w:gridCol w:w="1234"/>
+        <w:gridCol w:w="1234"/>
+      </w:tblGrid>
+      <w:tr>
+        <w:tc>
+          <w:tcPr>
+            <w:tcW w:type="dxa" w:w="1234"/>
+          </w:tcPr>
+          <w:p>
+            <w:r>
+              <w:t>Fuente</w:t>
+            </w:r>
+          </w:p>
+        </w:tc>
+        <w:tc>
+          <w:tcPr>
+            <w:tcW w:type="dxa" w:w="1234"/>
+          </w:tcPr>
+          <w:p>
+            <w:r>
+              <w:t>Tipo</w:t>
+            </w:r>
+          </w:p>
+        </w:tc>
+        <w:tc>
+          <w:tcPr>
+            <w:tcW w:type="dxa" w:w="1234"/>
+          </w:tcPr>
+          <w:p>
+            <w:r>
+              <w:t>Cuota del sector</w:t>
+            </w:r>
+          </w:p>
+        </w:tc>
+        <w:tc>
+          <w:tcPr>
+            <w:tcW w:type="dxa" w:w="1234"/>
+          </w:tcPr>
+          <w:p>
+            <w:r>
+              <w:t>Con la marca</w:t>
+            </w:r>
+          </w:p>
+        </w:tc>
+        <w:tc>
+          <w:tcPr>
+            <w:tcW w:type="dxa" w:w="1234"/>
+          </w:tcPr>
+          <w:p>
+            <w:r>
+              <w:t>Con competidores</w:t>
+            </w:r>
+          </w:p>
+        </w:tc>
+        <w:tc>
+          <w:tcPr>
+            <w:tcW w:type="dxa" w:w="1234"/>
+          </w:tcPr>
+          <w:p>
+            <w:r>
+              <w:t>Brecha</w:t>
+            </w:r>
+          </w:p>
+        </w:tc>
+        <w:tc>
+          <w:tcPr>
+            <w:tcW w:type="dxa" w:w="1234"/>
+          </w:tcPr>
+          <w:p>
+            <w:r>
+              <w:t>Prioridad</w:t>
+            </w:r>
+          </w:p>
+        </w:tc>
+      </w:tr>
+      <w:tr>
+        <w:tc>
+          <w:tcPr>
+            <w:tcW w:type="dxa" w:w="1234"/>
+          </w:tcPr>
+          <w:p>
+            <w:r>
+              <w:t>{%tr for r in fuentes_op.filas %}</w:t>
+            </w:r>
+          </w:p>
+        </w:tc>
+        <w:tc>
+          <w:tcPr>
+            <w:tcW w:type="dxa" w:w="1234"/>
+          </w:tcPr>
+          <w:p/>
+        </w:tc>
+        <w:tc>
+          <w:tcPr>
+            <w:tcW w:type="dxa" w:w="1234"/>
+          </w:tcPr>
+          <w:p/>
+        </w:tc>
+        <w:tc>
+          <w:tcPr>
+            <w:tcW w:type="dxa" w:w="1234"/>
+          </w:tcPr>
+          <w:p/>
+        </w:tc>
+        <w:tc>
+          <w:tcPr>
+            <w:tcW w:type="dxa" w:w="1234"/>
+          </w:tcPr>
+          <w:p/>
+        </w:tc>
+        <w:tc>
+          <w:tcPr>
+            <w:tcW w:type="dxa" w:w="1234"/>
+          </w:tcPr>
+          <w:p/>
+        </w:tc>
+        <w:tc>
+          <w:tcPr>
+            <w:tcW w:type="dxa" w:w="1234"/>
+          </w:tcPr>
+          <w:p/>
+        </w:tc>
+      </w:tr>
+      <w:tr>
+        <w:tc>
+          <w:tcPr>
+            <w:tcW w:type="dxa" w:w="1234"/>
+          </w:tcPr>
+          <w:p>
+            <w:r>
+              <w:t>{{ r.fuente }}</w:t>
+            </w:r>
+          </w:p>
+        </w:tc>
+        <w:tc>
+          <w:tcPr>
+            <w:tcW w:type="dxa" w:w="1234"/>
+          </w:tcPr>
+          <w:p>
+            <w:r>
+              <w:t>{{ r.tipo }}</w:t>
+            </w:r>
+          </w:p>
+        </w:tc>
+        <w:tc>
+          <w:tcPr>
+            <w:tcW w:type="dxa" w:w="1234"/>
+          </w:tcPr>
+          <w:p>
+            <w:r>
+              <w:t>{{ r.cuota }}</w:t>
+            </w:r>
+          </w:p>
+        </w:tc>
+        <w:tc>
+          <w:tcPr>
+            <w:tcW w:type="dxa" w:w="1234"/>
+          </w:tcPr>
+          <w:p>
+            <w:r>
+              <w:t>{{ r.marca }}</w:t>
+            </w:r>
+          </w:p>
+        </w:tc>
+        <w:tc>
+          <w:tcPr>
+            <w:tcW w:type="dxa" w:w="1234"/>
+          </w:tcPr>
+          <w:p>
+            <w:r>
+              <w:t>{{ r.competidores }}</w:t>
+            </w:r>
+          </w:p>
+        </w:tc>
+        <w:tc>
+          <w:tcPr>
+            <w:tcW w:type="dxa" w:w="1234"/>
+          </w:tcPr>
+          <w:p>
+            <w:r>
+              <w:t>{{ r.brecha }}</w:t>
+            </w:r>
+          </w:p>
+        </w:tc>
+        <w:tc>
+          <w:tcPr>
+            <w:tcW w:type="dxa" w:w="1234"/>
+          </w:tcPr>
+          <w:p>
+            <w:r>
+              <w:t>{{ r.prioridad }}</w:t>
+            </w:r>
+          </w:p>
+        </w:tc>
+      </w:tr>
+      <w:tr>
+        <w:tc>
+          <w:tcPr>
+            <w:tcW w:type="dxa" w:w="1234"/>
+          </w:tcPr>
+          <w:p>
+            <w:r>
+              <w:t>{%tr endfor %}</w:t>
+            </w:r>
+          </w:p>
+        </w:tc>
+        <w:tc>
+          <w:tcPr>
+            <w:tcW w:type="dxa" w:w="1234"/>
+          </w:tcPr>
+          <w:p/>
+        </w:tc>
+        <w:tc>
+          <w:tcPr>
+            <w:tcW w:type="dxa" w:w="1234"/>
+          </w:tcPr>
+          <w:p/>
+        </w:tc>
+        <w:tc>
+          <w:tcPr>
+            <w:tcW w:type="dxa" w:w="1234"/>
+          </w:tcPr>
+          <w:p/>
+        </w:tc>
+        <w:tc>
+          <w:tcPr>
+            <w:tcW w:type="dxa" w:w="1234"/>
+          </w:tcPr>
+          <w:p/>
+        </w:tc>
+        <w:tc>
+          <w:tcPr>
+            <w:tcW w:type="dxa" w:w="1234"/>
+          </w:tcPr>
+          <w:p/>
+        </w:tc>
+        <w:tc>
+          <w:tcPr>
+            <w:tcW w:type="dxa" w:w="1234"/>
+          </w:tcPr>
+          <w:p/>
+        </w:tc>
+      </w:tr>
+    </w:tbl>
+    <w:p/>
+    <w:p>
+      <w:r>
+        <w:t>{%p if fuentes_op.resto %}</w:t>
+      </w:r>
+    </w:p>
+    <w:p>
+      <w:r>
+        <w:t>{{ fuentes_op.resto }}</w:t>
+      </w:r>
+    </w:p>
+    <w:p>
+      <w:r>
+        <w:t>{%p endif %}</w:t>
+      </w:r>
+    </w:p>
+    <w:p>
+      <w:r>
+        <w:t>{%p else %}</w:t>
+      </w:r>
+    </w:p>
+    <w:p>
+      <w:r>
+        <w:t>{{ fuentes_op.aviso }}</w:t>
+      </w:r>
+    </w:p>
+    <w:p>
+      <w:r>
+        <w:t>{%p endif %}</w:t>
+      </w:r>
+    </w:p>
+    <w:p>
+      <w:pPr>
         <w:pStyle w:val="Heading1"/>
       </w:pPr>
       <w:r>
@@ -2817,6 +3967,28 @@
           </w:p>
         </w:tc>
       </w:tr>
+      <w:tr>
+        <w:tc>
+          <w:tcPr>
+            <w:tcW w:type="dxa" w:w="4320"/>
+          </w:tcPr>
+          <w:p>
+            <w:r>
+              <w:t>Contraste estadístico</w:t>
+            </w:r>
+          </w:p>
+        </w:tc>
+        <w:tc>
+          <w:tcPr>
+            <w:tcW w:type="dxa" w:w="4320"/>
+          </w:tcPr>
+          <w:p>
+            <w:r>
+              <w:t>{{ h.contraste }}</w:t>
+            </w:r>
+          </w:p>
+        </w:tc>
+      </w:tr>
     </w:tbl>
     <w:p/>
     <w:p>
@@ -2829,7 +4001,1061 @@
         <w:pStyle w:val="Heading1"/>
       </w:pPr>
       <w:r>
-        <w:t>7. Estrategia recomendada</w:t>
+        <w:t>7. Exactitud y lectura técnica de la marca</w:t>
+      </w:r>
+    </w:p>
+    <w:p>
+      <w:pPr>
+        <w:pStyle w:val="Heading2"/>
+      </w:pPr>
+      <w:r>
+        <w:t>Lo que dicen los motores de la marca</w:t>
+      </w:r>
+    </w:p>
+    <w:p>
+      <w:r>
+        <w:t>{%p if exactitud.hay %}</w:t>
+      </w:r>
+    </w:p>
+    <w:p>
+      <w:r>
+        <w:t>{{ exactitud.intro }}</w:t>
+      </w:r>
+    </w:p>
+    <w:tbl>
+      <w:tblPr>
+        <w:tblStyle w:val="LightGrid-Accent1"/>
+        <w:tblW w:type="auto" w:w="0"/>
+        <w:tblLook w:firstColumn="1" w:firstRow="1" w:lastColumn="0" w:lastRow="0" w:noHBand="0" w:noVBand="1" w:val="04A0"/>
+      </w:tblPr>
+      <w:tblGrid>
+        <w:gridCol w:w="4320"/>
+        <w:gridCol w:w="4320"/>
+      </w:tblGrid>
+      <w:tr>
+        <w:tc>
+          <w:tcPr>
+            <w:tcW w:type="dxa" w:w="4320"/>
+          </w:tcPr>
+          <w:p>
+            <w:r>
+              <w:t>Afirmaciones</w:t>
+            </w:r>
+          </w:p>
+        </w:tc>
+        <w:tc>
+          <w:tcPr>
+            <w:tcW w:type="dxa" w:w="4320"/>
+          </w:tcPr>
+          <w:p>
+            <w:r>
+              <w:t>Número</w:t>
+            </w:r>
+          </w:p>
+        </w:tc>
+      </w:tr>
+      <w:tr>
+        <w:tc>
+          <w:tcPr>
+            <w:tcW w:type="dxa" w:w="4320"/>
+          </w:tcPr>
+          <w:p>
+            <w:r>
+              <w:t>{%tr for r in exactitud.resumen %}</w:t>
+            </w:r>
+          </w:p>
+        </w:tc>
+        <w:tc>
+          <w:tcPr>
+            <w:tcW w:type="dxa" w:w="4320"/>
+          </w:tcPr>
+          <w:p/>
+        </w:tc>
+      </w:tr>
+      <w:tr>
+        <w:tc>
+          <w:tcPr>
+            <w:tcW w:type="dxa" w:w="4320"/>
+          </w:tcPr>
+          <w:p>
+            <w:r>
+              <w:t>{{ r.campo }}</w:t>
+            </w:r>
+          </w:p>
+        </w:tc>
+        <w:tc>
+          <w:tcPr>
+            <w:tcW w:type="dxa" w:w="4320"/>
+          </w:tcPr>
+          <w:p>
+            <w:r>
+              <w:t>{{ r.valor }}</w:t>
+            </w:r>
+          </w:p>
+        </w:tc>
+      </w:tr>
+      <w:tr>
+        <w:tc>
+          <w:tcPr>
+            <w:tcW w:type="dxa" w:w="4320"/>
+          </w:tcPr>
+          <w:p>
+            <w:r>
+              <w:t>{%tr endfor %}</w:t>
+            </w:r>
+          </w:p>
+        </w:tc>
+        <w:tc>
+          <w:tcPr>
+            <w:tcW w:type="dxa" w:w="4320"/>
+          </w:tcPr>
+          <w:p/>
+        </w:tc>
+      </w:tr>
+    </w:tbl>
+    <w:p/>
+    <w:p>
+      <w:pPr>
+        <w:pStyle w:val="Heading3"/>
+      </w:pPr>
+      <w:r>
+        <w:t>Afirmaciones a revisar</w:t>
+      </w:r>
+    </w:p>
+    <w:tbl>
+      <w:tblPr>
+        <w:tblStyle w:val="LightGrid-Accent1"/>
+        <w:tblW w:type="auto" w:w="0"/>
+        <w:tblLook w:firstColumn="1" w:firstRow="1" w:lastColumn="0" w:lastRow="0" w:noHBand="0" w:noVBand="1" w:val="04A0"/>
+      </w:tblPr>
+      <w:tblGrid>
+        <w:gridCol w:w="2160"/>
+        <w:gridCol w:w="2160"/>
+        <w:gridCol w:w="2160"/>
+        <w:gridCol w:w="2160"/>
+      </w:tblGrid>
+      <w:tr>
+        <w:tc>
+          <w:tcPr>
+            <w:tcW w:type="dxa" w:w="2160"/>
+          </w:tcPr>
+          <w:p>
+            <w:r>
+              <w:t>Motor</w:t>
+            </w:r>
+          </w:p>
+        </w:tc>
+        <w:tc>
+          <w:tcPr>
+            <w:tcW w:type="dxa" w:w="2160"/>
+          </w:tcPr>
+          <w:p>
+            <w:r>
+              <w:t>Lo que dice el motor</w:t>
+            </w:r>
+          </w:p>
+        </w:tc>
+        <w:tc>
+          <w:tcPr>
+            <w:tcW w:type="dxa" w:w="2160"/>
+          </w:tcPr>
+          <w:p>
+            <w:r>
+              <w:t>Estado</w:t>
+            </w:r>
+          </w:p>
+        </w:tc>
+        <w:tc>
+          <w:tcPr>
+            <w:tcW w:type="dxa" w:w="2160"/>
+          </w:tcPr>
+          <w:p>
+            <w:r>
+              <w:t>Motivo</w:t>
+            </w:r>
+          </w:p>
+        </w:tc>
+      </w:tr>
+      <w:tr>
+        <w:tc>
+          <w:tcPr>
+            <w:tcW w:type="dxa" w:w="2160"/>
+          </w:tcPr>
+          <w:p>
+            <w:r>
+              <w:t>{%tr for r in exactitud.revisar %}</w:t>
+            </w:r>
+          </w:p>
+        </w:tc>
+        <w:tc>
+          <w:tcPr>
+            <w:tcW w:type="dxa" w:w="2160"/>
+          </w:tcPr>
+          <w:p/>
+        </w:tc>
+        <w:tc>
+          <w:tcPr>
+            <w:tcW w:type="dxa" w:w="2160"/>
+          </w:tcPr>
+          <w:p/>
+        </w:tc>
+        <w:tc>
+          <w:tcPr>
+            <w:tcW w:type="dxa" w:w="2160"/>
+          </w:tcPr>
+          <w:p/>
+        </w:tc>
+      </w:tr>
+      <w:tr>
+        <w:tc>
+          <w:tcPr>
+            <w:tcW w:type="dxa" w:w="2160"/>
+          </w:tcPr>
+          <w:p>
+            <w:r>
+              <w:t>{{ r.motor }}</w:t>
+            </w:r>
+          </w:p>
+        </w:tc>
+        <w:tc>
+          <w:tcPr>
+            <w:tcW w:type="dxa" w:w="2160"/>
+          </w:tcPr>
+          <w:p>
+            <w:r>
+              <w:t>{{ r.texto }}</w:t>
+            </w:r>
+          </w:p>
+        </w:tc>
+        <w:tc>
+          <w:tcPr>
+            <w:tcW w:type="dxa" w:w="2160"/>
+          </w:tcPr>
+          <w:p>
+            <w:r>
+              <w:t>{{ r.estado }}</w:t>
+            </w:r>
+          </w:p>
+        </w:tc>
+        <w:tc>
+          <w:tcPr>
+            <w:tcW w:type="dxa" w:w="2160"/>
+          </w:tcPr>
+          <w:p>
+            <w:r>
+              <w:t>{{ r.motivo }}</w:t>
+            </w:r>
+          </w:p>
+        </w:tc>
+      </w:tr>
+      <w:tr>
+        <w:tc>
+          <w:tcPr>
+            <w:tcW w:type="dxa" w:w="2160"/>
+          </w:tcPr>
+          <w:p>
+            <w:r>
+              <w:t>{%tr endfor %}</w:t>
+            </w:r>
+          </w:p>
+        </w:tc>
+        <w:tc>
+          <w:tcPr>
+            <w:tcW w:type="dxa" w:w="2160"/>
+          </w:tcPr>
+          <w:p/>
+        </w:tc>
+        <w:tc>
+          <w:tcPr>
+            <w:tcW w:type="dxa" w:w="2160"/>
+          </w:tcPr>
+          <w:p/>
+        </w:tc>
+        <w:tc>
+          <w:tcPr>
+            <w:tcW w:type="dxa" w:w="2160"/>
+          </w:tcPr>
+          <w:p/>
+        </w:tc>
+      </w:tr>
+    </w:tbl>
+    <w:p/>
+    <w:p>
+      <w:r>
+        <w:t>{%p if exactitud.resto %}</w:t>
+      </w:r>
+    </w:p>
+    <w:p>
+      <w:r>
+        <w:t>{{ exactitud.resto }}</w:t>
+      </w:r>
+    </w:p>
+    <w:p>
+      <w:r>
+        <w:t>{%p endif %}</w:t>
+      </w:r>
+    </w:p>
+    <w:p>
+      <w:pPr>
+        <w:pStyle w:val="Heading3"/>
+      </w:pPr>
+      <w:r>
+        <w:t>Mitigaciones en origen</w:t>
+      </w:r>
+    </w:p>
+    <w:p>
+      <w:r>
+        <w:t>{%p if exactitud.mitigaciones %}</w:t>
+      </w:r>
+    </w:p>
+    <w:tbl>
+      <w:tblPr>
+        <w:tblStyle w:val="LightGrid-Accent1"/>
+        <w:tblW w:type="auto" w:w="0"/>
+        <w:tblLook w:firstColumn="1" w:firstRow="1" w:lastColumn="0" w:lastRow="0" w:noHBand="0" w:noVBand="1" w:val="04A0"/>
+      </w:tblPr>
+      <w:tblGrid>
+        <w:gridCol w:w="2160"/>
+        <w:gridCol w:w="2160"/>
+        <w:gridCol w:w="2160"/>
+        <w:gridCol w:w="2160"/>
+      </w:tblGrid>
+      <w:tr>
+        <w:tc>
+          <w:tcPr>
+            <w:tcW w:type="dxa" w:w="2160"/>
+          </w:tcPr>
+          <w:p>
+            <w:r>
+              <w:t>Id</w:t>
+            </w:r>
+          </w:p>
+        </w:tc>
+        <w:tc>
+          <w:tcPr>
+            <w:tcW w:type="dxa" w:w="2160"/>
+          </w:tcPr>
+          <w:p>
+            <w:r>
+              <w:t>Acción</w:t>
+            </w:r>
+          </w:p>
+        </w:tc>
+        <w:tc>
+          <w:tcPr>
+            <w:tcW w:type="dxa" w:w="2160"/>
+          </w:tcPr>
+          <w:p>
+            <w:r>
+              <w:t>Fuente que lo publica</w:t>
+            </w:r>
+          </w:p>
+        </w:tc>
+        <w:tc>
+          <w:tcPr>
+            <w:tcW w:type="dxa" w:w="2160"/>
+          </w:tcPr>
+          <w:p>
+            <w:r>
+              <w:t>Afirmaciones</w:t>
+            </w:r>
+          </w:p>
+        </w:tc>
+      </w:tr>
+      <w:tr>
+        <w:tc>
+          <w:tcPr>
+            <w:tcW w:type="dxa" w:w="2160"/>
+          </w:tcPr>
+          <w:p>
+            <w:r>
+              <w:t>{%tr for r in exactitud.mitigaciones %}</w:t>
+            </w:r>
+          </w:p>
+        </w:tc>
+        <w:tc>
+          <w:tcPr>
+            <w:tcW w:type="dxa" w:w="2160"/>
+          </w:tcPr>
+          <w:p/>
+        </w:tc>
+        <w:tc>
+          <w:tcPr>
+            <w:tcW w:type="dxa" w:w="2160"/>
+          </w:tcPr>
+          <w:p/>
+        </w:tc>
+        <w:tc>
+          <w:tcPr>
+            <w:tcW w:type="dxa" w:w="2160"/>
+          </w:tcPr>
+          <w:p/>
+        </w:tc>
+      </w:tr>
+      <w:tr>
+        <w:tc>
+          <w:tcPr>
+            <w:tcW w:type="dxa" w:w="2160"/>
+          </w:tcPr>
+          <w:p>
+            <w:r>
+              <w:t>{{ r.id }}</w:t>
+            </w:r>
+          </w:p>
+        </w:tc>
+        <w:tc>
+          <w:tcPr>
+            <w:tcW w:type="dxa" w:w="2160"/>
+          </w:tcPr>
+          <w:p>
+            <w:r>
+              <w:t>{{ r.descripcion }}</w:t>
+            </w:r>
+          </w:p>
+        </w:tc>
+        <w:tc>
+          <w:tcPr>
+            <w:tcW w:type="dxa" w:w="2160"/>
+          </w:tcPr>
+          <w:p>
+            <w:r>
+              <w:t>{{ r.fuente }}</w:t>
+            </w:r>
+          </w:p>
+        </w:tc>
+        <w:tc>
+          <w:tcPr>
+            <w:tcW w:type="dxa" w:w="2160"/>
+          </w:tcPr>
+          <w:p>
+            <w:r>
+              <w:t>{{ r.afirmaciones }}</w:t>
+            </w:r>
+          </w:p>
+        </w:tc>
+      </w:tr>
+      <w:tr>
+        <w:tc>
+          <w:tcPr>
+            <w:tcW w:type="dxa" w:w="2160"/>
+          </w:tcPr>
+          <w:p>
+            <w:r>
+              <w:t>{%tr endfor %}</w:t>
+            </w:r>
+          </w:p>
+        </w:tc>
+        <w:tc>
+          <w:tcPr>
+            <w:tcW w:type="dxa" w:w="2160"/>
+          </w:tcPr>
+          <w:p/>
+        </w:tc>
+        <w:tc>
+          <w:tcPr>
+            <w:tcW w:type="dxa" w:w="2160"/>
+          </w:tcPr>
+          <w:p/>
+        </w:tc>
+        <w:tc>
+          <w:tcPr>
+            <w:tcW w:type="dxa" w:w="2160"/>
+          </w:tcPr>
+          <w:p/>
+        </w:tc>
+      </w:tr>
+    </w:tbl>
+    <w:p/>
+    <w:p>
+      <w:r>
+        <w:t>{%p else %}</w:t>
+      </w:r>
+    </w:p>
+    <w:p>
+      <w:r>
+        <w:t>{{ exactitud.sin_mitigaciones }}</w:t>
+      </w:r>
+    </w:p>
+    <w:p>
+      <w:r>
+        <w:t>{%p endif %}</w:t>
+      </w:r>
+    </w:p>
+    <w:p>
+      <w:r>
+        <w:t>{%p else %}</w:t>
+      </w:r>
+    </w:p>
+    <w:p>
+      <w:r>
+        <w:t>{{ exactitud.aviso }}</w:t>
+      </w:r>
+    </w:p>
+    <w:p>
+      <w:r>
+        <w:t>{%p endif %}</w:t>
+      </w:r>
+    </w:p>
+    <w:p>
+      <w:r>
+        <w:t>{%p if auditoria.hay %}</w:t>
+      </w:r>
+    </w:p>
+    <w:p>
+      <w:pPr>
+        <w:pStyle w:val="Heading2"/>
+      </w:pPr>
+      <w:r>
+        <w:t>Auditoría técnica de la web: {{ auditoria.dominio }}</w:t>
+      </w:r>
+    </w:p>
+    <w:p>
+      <w:r>
+        <w:t>{{ auditoria.intro }}</w:t>
+      </w:r>
+    </w:p>
+    <w:p>
+      <w:r>
+        <w:t>{%p if auditoria.aviso %}</w:t>
+      </w:r>
+    </w:p>
+    <w:p>
+      <w:pPr>
+        <w:pStyle w:val="IntenseQuote"/>
+      </w:pPr>
+      <w:r>
+        <w:t>{{ auditoria.aviso }}</w:t>
+      </w:r>
+    </w:p>
+    <w:p>
+      <w:r>
+        <w:t>{%p endif %}</w:t>
+      </w:r>
+    </w:p>
+    <w:tbl>
+      <w:tblPr>
+        <w:tblStyle w:val="LightList-Accent1"/>
+        <w:tblW w:type="auto" w:w="0"/>
+        <w:tblLook w:firstColumn="1" w:firstRow="1" w:lastColumn="0" w:lastRow="0" w:noHBand="0" w:noVBand="1" w:val="04A0"/>
+      </w:tblPr>
+      <w:tblGrid>
+        <w:gridCol w:w="4320"/>
+        <w:gridCol w:w="4320"/>
+      </w:tblGrid>
+      <w:tr>
+        <w:tc>
+          <w:tcPr>
+            <w:tcW w:type="dxa" w:w="4320"/>
+          </w:tcPr>
+          <w:p>
+            <w:r>
+              <w:t>Preparación para los motores</w:t>
+            </w:r>
+          </w:p>
+        </w:tc>
+        <w:tc>
+          <w:tcPr>
+            <w:tcW w:type="dxa" w:w="4320"/>
+          </w:tcPr>
+          <w:p>
+            <w:r>
+              <w:t>{{ auditoria.puntuacion }}</w:t>
+            </w:r>
+          </w:p>
+        </w:tc>
+      </w:tr>
+      <w:tr>
+        <w:tc>
+          <w:tcPr>
+            <w:tcW w:type="dxa" w:w="4320"/>
+          </w:tcPr>
+          <w:p>
+            <w:r>
+              <w:t>Fecha de la auditoría</w:t>
+            </w:r>
+          </w:p>
+        </w:tc>
+        <w:tc>
+          <w:tcPr>
+            <w:tcW w:type="dxa" w:w="4320"/>
+          </w:tcPr>
+          <w:p>
+            <w:r>
+              <w:t>{{ auditoria.fecha }}</w:t>
+            </w:r>
+          </w:p>
+        </w:tc>
+      </w:tr>
+    </w:tbl>
+    <w:p/>
+    <w:tbl>
+      <w:tblPr>
+        <w:tblStyle w:val="LightGrid-Accent1"/>
+        <w:tblW w:type="auto" w:w="0"/>
+        <w:tblLook w:firstColumn="1" w:firstRow="1" w:lastColumn="0" w:lastRow="0" w:noHBand="0" w:noVBand="1" w:val="04A0"/>
+      </w:tblPr>
+      <w:tblGrid>
+        <w:gridCol w:w="2160"/>
+        <w:gridCol w:w="2160"/>
+        <w:gridCol w:w="2160"/>
+        <w:gridCol w:w="2160"/>
+      </w:tblGrid>
+      <w:tr>
+        <w:tc>
+          <w:tcPr>
+            <w:tcW w:type="dxa" w:w="2160"/>
+          </w:tcPr>
+          <w:p>
+            <w:r>
+              <w:t>Bloque</w:t>
+            </w:r>
+          </w:p>
+        </w:tc>
+        <w:tc>
+          <w:tcPr>
+            <w:tcW w:type="dxa" w:w="2160"/>
+          </w:tcPr>
+          <w:p>
+            <w:r>
+              <w:t>Puntuación</w:t>
+            </w:r>
+          </w:p>
+        </w:tc>
+        <w:tc>
+          <w:tcPr>
+            <w:tcW w:type="dxa" w:w="2160"/>
+          </w:tcPr>
+          <w:p>
+            <w:r>
+              <w:t>Correctas</w:t>
+            </w:r>
+          </w:p>
+        </w:tc>
+        <w:tc>
+          <w:tcPr>
+            <w:tcW w:type="dxa" w:w="2160"/>
+          </w:tcPr>
+          <w:p>
+            <w:r>
+              <w:t>Fallan</w:t>
+            </w:r>
+          </w:p>
+        </w:tc>
+      </w:tr>
+      <w:tr>
+        <w:tc>
+          <w:tcPr>
+            <w:tcW w:type="dxa" w:w="2160"/>
+          </w:tcPr>
+          <w:p>
+            <w:r>
+              <w:t>{%tr for r in auditoria.bloques %}</w:t>
+            </w:r>
+          </w:p>
+        </w:tc>
+        <w:tc>
+          <w:tcPr>
+            <w:tcW w:type="dxa" w:w="2160"/>
+          </w:tcPr>
+          <w:p/>
+        </w:tc>
+        <w:tc>
+          <w:tcPr>
+            <w:tcW w:type="dxa" w:w="2160"/>
+          </w:tcPr>
+          <w:p/>
+        </w:tc>
+        <w:tc>
+          <w:tcPr>
+            <w:tcW w:type="dxa" w:w="2160"/>
+          </w:tcPr>
+          <w:p/>
+        </w:tc>
+      </w:tr>
+      <w:tr>
+        <w:tc>
+          <w:tcPr>
+            <w:tcW w:type="dxa" w:w="2160"/>
+          </w:tcPr>
+          <w:p>
+            <w:r>
+              <w:t>{{ r.bloque }}</w:t>
+            </w:r>
+          </w:p>
+        </w:tc>
+        <w:tc>
+          <w:tcPr>
+            <w:tcW w:type="dxa" w:w="2160"/>
+          </w:tcPr>
+          <w:p>
+            <w:r>
+              <w:t>{{ r.puntuacion }}</w:t>
+            </w:r>
+          </w:p>
+        </w:tc>
+        <w:tc>
+          <w:tcPr>
+            <w:tcW w:type="dxa" w:w="2160"/>
+          </w:tcPr>
+          <w:p>
+            <w:r>
+              <w:t>{{ r.ok }}</w:t>
+            </w:r>
+          </w:p>
+        </w:tc>
+        <w:tc>
+          <w:tcPr>
+            <w:tcW w:type="dxa" w:w="2160"/>
+          </w:tcPr>
+          <w:p>
+            <w:r>
+              <w:t>{{ r.falla }}</w:t>
+            </w:r>
+          </w:p>
+        </w:tc>
+      </w:tr>
+      <w:tr>
+        <w:tc>
+          <w:tcPr>
+            <w:tcW w:type="dxa" w:w="2160"/>
+          </w:tcPr>
+          <w:p>
+            <w:r>
+              <w:t>{%tr endfor %}</w:t>
+            </w:r>
+          </w:p>
+        </w:tc>
+        <w:tc>
+          <w:tcPr>
+            <w:tcW w:type="dxa" w:w="2160"/>
+          </w:tcPr>
+          <w:p/>
+        </w:tc>
+        <w:tc>
+          <w:tcPr>
+            <w:tcW w:type="dxa" w:w="2160"/>
+          </w:tcPr>
+          <w:p/>
+        </w:tc>
+        <w:tc>
+          <w:tcPr>
+            <w:tcW w:type="dxa" w:w="2160"/>
+          </w:tcPr>
+          <w:p/>
+        </w:tc>
+      </w:tr>
+    </w:tbl>
+    <w:p/>
+    <w:p>
+      <w:pPr>
+        <w:pStyle w:val="Heading3"/>
+      </w:pPr>
+      <w:r>
+        <w:t>Comprobaciones que fallan</w:t>
+      </w:r>
+    </w:p>
+    <w:tbl>
+      <w:tblPr>
+        <w:tblStyle w:val="LightGrid-Accent1"/>
+        <w:tblW w:type="auto" w:w="0"/>
+        <w:tblLook w:firstColumn="1" w:firstRow="1" w:lastColumn="0" w:lastRow="0" w:noHBand="0" w:noVBand="1" w:val="04A0"/>
+      </w:tblPr>
+      <w:tblGrid>
+        <w:gridCol w:w="2160"/>
+        <w:gridCol w:w="2160"/>
+        <w:gridCol w:w="2160"/>
+        <w:gridCol w:w="2160"/>
+      </w:tblGrid>
+      <w:tr>
+        <w:tc>
+          <w:tcPr>
+            <w:tcW w:type="dxa" w:w="2160"/>
+          </w:tcPr>
+          <w:p>
+            <w:r>
+              <w:t>Comprobación</w:t>
+            </w:r>
+          </w:p>
+        </w:tc>
+        <w:tc>
+          <w:tcPr>
+            <w:tcW w:type="dxa" w:w="2160"/>
+          </w:tcPr>
+          <w:p>
+            <w:r>
+              <w:t>Detalle</w:t>
+            </w:r>
+          </w:p>
+        </w:tc>
+        <w:tc>
+          <w:tcPr>
+            <w:tcW w:type="dxa" w:w="2160"/>
+          </w:tcPr>
+          <w:p>
+            <w:r>
+              <w:t>Motores afectados</w:t>
+            </w:r>
+          </w:p>
+        </w:tc>
+        <w:tc>
+          <w:tcPr>
+            <w:tcW w:type="dxa" w:w="2160"/>
+          </w:tcPr>
+          <w:p>
+            <w:r>
+              <w:t>Evidencia</w:t>
+            </w:r>
+          </w:p>
+        </w:tc>
+      </w:tr>
+      <w:tr>
+        <w:tc>
+          <w:tcPr>
+            <w:tcW w:type="dxa" w:w="2160"/>
+          </w:tcPr>
+          <w:p>
+            <w:r>
+              <w:t>{%tr for r in auditoria.fallos %}</w:t>
+            </w:r>
+          </w:p>
+        </w:tc>
+        <w:tc>
+          <w:tcPr>
+            <w:tcW w:type="dxa" w:w="2160"/>
+          </w:tcPr>
+          <w:p/>
+        </w:tc>
+        <w:tc>
+          <w:tcPr>
+            <w:tcW w:type="dxa" w:w="2160"/>
+          </w:tcPr>
+          <w:p/>
+        </w:tc>
+        <w:tc>
+          <w:tcPr>
+            <w:tcW w:type="dxa" w:w="2160"/>
+          </w:tcPr>
+          <w:p/>
+        </w:tc>
+      </w:tr>
+      <w:tr>
+        <w:tc>
+          <w:tcPr>
+            <w:tcW w:type="dxa" w:w="2160"/>
+          </w:tcPr>
+          <w:p>
+            <w:r>
+              <w:t>{{ r.titulo }}</w:t>
+            </w:r>
+          </w:p>
+        </w:tc>
+        <w:tc>
+          <w:tcPr>
+            <w:tcW w:type="dxa" w:w="2160"/>
+          </w:tcPr>
+          <w:p>
+            <w:r>
+              <w:t>{{ r.detalle }}</w:t>
+            </w:r>
+          </w:p>
+        </w:tc>
+        <w:tc>
+          <w:tcPr>
+            <w:tcW w:type="dxa" w:w="2160"/>
+          </w:tcPr>
+          <w:p>
+            <w:r>
+              <w:t>{{ r.motores }}</w:t>
+            </w:r>
+          </w:p>
+        </w:tc>
+        <w:tc>
+          <w:tcPr>
+            <w:tcW w:type="dxa" w:w="2160"/>
+          </w:tcPr>
+          <w:p>
+            <w:r>
+              <w:t>{{ r.evidencia }}</w:t>
+            </w:r>
+          </w:p>
+        </w:tc>
+      </w:tr>
+      <w:tr>
+        <w:tc>
+          <w:tcPr>
+            <w:tcW w:type="dxa" w:w="2160"/>
+          </w:tcPr>
+          <w:p>
+            <w:r>
+              <w:t>{%tr endfor %}</w:t>
+            </w:r>
+          </w:p>
+        </w:tc>
+        <w:tc>
+          <w:tcPr>
+            <w:tcW w:type="dxa" w:w="2160"/>
+          </w:tcPr>
+          <w:p/>
+        </w:tc>
+        <w:tc>
+          <w:tcPr>
+            <w:tcW w:type="dxa" w:w="2160"/>
+          </w:tcPr>
+          <w:p/>
+        </w:tc>
+        <w:tc>
+          <w:tcPr>
+            <w:tcW w:type="dxa" w:w="2160"/>
+          </w:tcPr>
+          <w:p/>
+        </w:tc>
+      </w:tr>
+    </w:tbl>
+    <w:p/>
+    <w:p>
+      <w:pPr>
+        <w:pStyle w:val="Heading3"/>
+      </w:pPr>
+      <w:r>
+        <w:t>Acceso de los bots de IA</w:t>
+      </w:r>
+    </w:p>
+    <w:tbl>
+      <w:tblPr>
+        <w:tblStyle w:val="LightGrid-Accent1"/>
+        <w:tblW w:type="auto" w:w="0"/>
+        <w:tblLook w:firstColumn="1" w:firstRow="1" w:lastColumn="0" w:lastRow="0" w:noHBand="0" w:noVBand="1" w:val="04A0"/>
+      </w:tblPr>
+      <w:tblGrid>
+        <w:gridCol w:w="2880"/>
+        <w:gridCol w:w="2880"/>
+        <w:gridCol w:w="2880"/>
+      </w:tblGrid>
+      <w:tr>
+        <w:tc>
+          <w:tcPr>
+            <w:tcW w:type="dxa" w:w="2880"/>
+          </w:tcPr>
+          <w:p>
+            <w:r>
+              <w:t>Bot</w:t>
+            </w:r>
+          </w:p>
+        </w:tc>
+        <w:tc>
+          <w:tcPr>
+            <w:tcW w:type="dxa" w:w="2880"/>
+          </w:tcPr>
+          <w:p>
+            <w:r>
+              <w:t>Motor</w:t>
+            </w:r>
+          </w:p>
+        </w:tc>
+        <w:tc>
+          <w:tcPr>
+            <w:tcW w:type="dxa" w:w="2880"/>
+          </w:tcPr>
+          <w:p>
+            <w:r>
+              <w:t>Permitido</w:t>
+            </w:r>
+          </w:p>
+        </w:tc>
+      </w:tr>
+      <w:tr>
+        <w:tc>
+          <w:tcPr>
+            <w:tcW w:type="dxa" w:w="2880"/>
+          </w:tcPr>
+          <w:p>
+            <w:r>
+              <w:t>{%tr for r in auditoria.bots %}</w:t>
+            </w:r>
+          </w:p>
+        </w:tc>
+        <w:tc>
+          <w:tcPr>
+            <w:tcW w:type="dxa" w:w="2880"/>
+          </w:tcPr>
+          <w:p/>
+        </w:tc>
+        <w:tc>
+          <w:tcPr>
+            <w:tcW w:type="dxa" w:w="2880"/>
+          </w:tcPr>
+          <w:p/>
+        </w:tc>
+      </w:tr>
+      <w:tr>
+        <w:tc>
+          <w:tcPr>
+            <w:tcW w:type="dxa" w:w="2880"/>
+          </w:tcPr>
+          <w:p>
+            <w:r>
+              <w:t>{{ r.bot }}</w:t>
+            </w:r>
+          </w:p>
+        </w:tc>
+        <w:tc>
+          <w:tcPr>
+            <w:tcW w:type="dxa" w:w="2880"/>
+          </w:tcPr>
+          <w:p>
+            <w:r>
+              <w:t>{{ r.motor }}</w:t>
+            </w:r>
+          </w:p>
+        </w:tc>
+        <w:tc>
+          <w:tcPr>
+            <w:tcW w:type="dxa" w:w="2880"/>
+          </w:tcPr>
+          <w:p>
+            <w:r>
+              <w:t>{{ r.permitido }}</w:t>
+            </w:r>
+          </w:p>
+        </w:tc>
+      </w:tr>
+      <w:tr>
+        <w:tc>
+          <w:tcPr>
+            <w:tcW w:type="dxa" w:w="2880"/>
+          </w:tcPr>
+          <w:p>
+            <w:r>
+              <w:t>{%tr endfor %}</w:t>
+            </w:r>
+          </w:p>
+        </w:tc>
+        <w:tc>
+          <w:tcPr>
+            <w:tcW w:type="dxa" w:w="2880"/>
+          </w:tcPr>
+          <w:p/>
+        </w:tc>
+        <w:tc>
+          <w:tcPr>
+            <w:tcW w:type="dxa" w:w="2880"/>
+          </w:tcPr>
+          <w:p/>
+        </w:tc>
+      </w:tr>
+    </w:tbl>
+    <w:p/>
+    <w:p>
+      <w:r>
+        <w:t>{%p endif %}</w:t>
+      </w:r>
+    </w:p>
+    <w:p>
+      <w:pPr>
+        <w:pStyle w:val="Heading1"/>
+      </w:pPr>
+      <w:r>
+        <w:t>8. Estrategia recomendada</w:t>
       </w:r>
     </w:p>
     <w:p>
@@ -3044,7 +5270,7 @@
         <w:pStyle w:val="Heading1"/>
       </w:pPr>
       <w:r>
-        <w:t>8. Plan de acción por fases</w:t>
+        <w:t>9. Plan de acción por fases</w:t>
       </w:r>
     </w:p>
     <w:tbl>
@@ -3403,7 +5629,22 @@
         <w:pStyle w:val="Heading1"/>
       </w:pPr>
       <w:r>
-        <w:t>9. Medición y seguimiento</w:t>
+        <w:t>10. Escenarios y simulación del plan</w:t>
+      </w:r>
+    </w:p>
+    <w:p>
+      <w:r>
+        <w:t>{%p if escenarios.hay %}</w:t>
+      </w:r>
+    </w:p>
+    <w:p>
+      <w:r>
+        <w:t>{{ escenarios.intro }}</w:t>
+      </w:r>
+    </w:p>
+    <w:p>
+      <w:r>
+        <w:t>{%p if escenarios.hay_escenarios %}</w:t>
       </w:r>
     </w:p>
     <w:p>
@@ -3411,7 +5652,725 @@
         <w:pStyle w:val="Heading2"/>
       </w:pPr>
       <w:r>
-        <w:t>KPIs</w:t>
+        <w:t>Escenarios del plan</w:t>
+      </w:r>
+    </w:p>
+    <w:tbl>
+      <w:tblPr>
+        <w:tblStyle w:val="LightGrid-Accent1"/>
+        <w:tblW w:type="auto" w:w="0"/>
+        <w:tblLook w:firstColumn="1" w:firstRow="1" w:lastColumn="0" w:lastRow="0" w:noHBand="0" w:noVBand="1" w:val="04A0"/>
+      </w:tblPr>
+      <w:tblGrid>
+        <w:gridCol w:w="1440"/>
+        <w:gridCol w:w="1440"/>
+        <w:gridCol w:w="1440"/>
+        <w:gridCol w:w="1440"/>
+        <w:gridCol w:w="1440"/>
+        <w:gridCol w:w="1440"/>
+      </w:tblGrid>
+      <w:tr>
+        <w:tc>
+          <w:tcPr>
+            <w:tcW w:type="dxa" w:w="1440"/>
+          </w:tcPr>
+          <w:p>
+            <w:r>
+              <w:t>Escenario</w:t>
+            </w:r>
+          </w:p>
+        </w:tc>
+        <w:tc>
+          <w:tcPr>
+            <w:tcW w:type="dxa" w:w="1440"/>
+          </w:tcPr>
+          <w:p>
+            <w:r>
+              <w:t>Acciones</w:t>
+            </w:r>
+          </w:p>
+        </w:tc>
+        <w:tc>
+          <w:tcPr>
+            <w:tcW w:type="dxa" w:w="1440"/>
+          </w:tcPr>
+          <w:p>
+            <w:r>
+              <w:t>Aplazadas</w:t>
+            </w:r>
+          </w:p>
+        </w:tc>
+        <w:tc>
+          <w:tcPr>
+            <w:tcW w:type="dxa" w:w="1440"/>
+          </w:tcPr>
+          <w:p>
+            <w:r>
+              <w:t>Hallazgos sin cubrir</w:t>
+            </w:r>
+          </w:p>
+        </w:tc>
+        <w:tc>
+          <w:tcPr>
+            <w:tcW w:type="dxa" w:w="1440"/>
+          </w:tcPr>
+          <w:p>
+            <w:r>
+              <w:t>Esfuerzo</w:t>
+            </w:r>
+          </w:p>
+        </w:tc>
+        <w:tc>
+          <w:tcPr>
+            <w:tcW w:type="dxa" w:w="1440"/>
+          </w:tcPr>
+          <w:p>
+            <w:r>
+              <w:t>Score proyectado [mín.–máx.]</w:t>
+            </w:r>
+          </w:p>
+        </w:tc>
+      </w:tr>
+      <w:tr>
+        <w:tc>
+          <w:tcPr>
+            <w:tcW w:type="dxa" w:w="1440"/>
+          </w:tcPr>
+          <w:p>
+            <w:r>
+              <w:t>{%tr for r in escenarios.escenarios %}</w:t>
+            </w:r>
+          </w:p>
+        </w:tc>
+        <w:tc>
+          <w:tcPr>
+            <w:tcW w:type="dxa" w:w="1440"/>
+          </w:tcPr>
+          <w:p/>
+        </w:tc>
+        <w:tc>
+          <w:tcPr>
+            <w:tcW w:type="dxa" w:w="1440"/>
+          </w:tcPr>
+          <w:p/>
+        </w:tc>
+        <w:tc>
+          <w:tcPr>
+            <w:tcW w:type="dxa" w:w="1440"/>
+          </w:tcPr>
+          <w:p/>
+        </w:tc>
+        <w:tc>
+          <w:tcPr>
+            <w:tcW w:type="dxa" w:w="1440"/>
+          </w:tcPr>
+          <w:p/>
+        </w:tc>
+        <w:tc>
+          <w:tcPr>
+            <w:tcW w:type="dxa" w:w="1440"/>
+          </w:tcPr>
+          <w:p/>
+        </w:tc>
+      </w:tr>
+      <w:tr>
+        <w:tc>
+          <w:tcPr>
+            <w:tcW w:type="dxa" w:w="1440"/>
+          </w:tcPr>
+          <w:p>
+            <w:r>
+              <w:t>{{ r.nombre }}</w:t>
+            </w:r>
+          </w:p>
+        </w:tc>
+        <w:tc>
+          <w:tcPr>
+            <w:tcW w:type="dxa" w:w="1440"/>
+          </w:tcPr>
+          <w:p>
+            <w:r>
+              <w:t>{{ r.mantenidas }}</w:t>
+            </w:r>
+          </w:p>
+        </w:tc>
+        <w:tc>
+          <w:tcPr>
+            <w:tcW w:type="dxa" w:w="1440"/>
+          </w:tcPr>
+          <w:p>
+            <w:r>
+              <w:t>{{ r.aplazadas }}</w:t>
+            </w:r>
+          </w:p>
+        </w:tc>
+        <w:tc>
+          <w:tcPr>
+            <w:tcW w:type="dxa" w:w="1440"/>
+          </w:tcPr>
+          <w:p>
+            <w:r>
+              <w:t>{{ r.sin_cubrir }}</w:t>
+            </w:r>
+          </w:p>
+        </w:tc>
+        <w:tc>
+          <w:tcPr>
+            <w:tcW w:type="dxa" w:w="1440"/>
+          </w:tcPr>
+          <w:p>
+            <w:r>
+              <w:t>{{ r.esfuerzo }}</w:t>
+            </w:r>
+          </w:p>
+        </w:tc>
+        <w:tc>
+          <w:tcPr>
+            <w:tcW w:type="dxa" w:w="1440"/>
+          </w:tcPr>
+          <w:p>
+            <w:r>
+              <w:t>{{ r.score }}</w:t>
+            </w:r>
+          </w:p>
+        </w:tc>
+      </w:tr>
+      <w:tr>
+        <w:tc>
+          <w:tcPr>
+            <w:tcW w:type="dxa" w:w="1440"/>
+          </w:tcPr>
+          <w:p>
+            <w:r>
+              <w:t>{%tr endfor %}</w:t>
+            </w:r>
+          </w:p>
+        </w:tc>
+        <w:tc>
+          <w:tcPr>
+            <w:tcW w:type="dxa" w:w="1440"/>
+          </w:tcPr>
+          <w:p/>
+        </w:tc>
+        <w:tc>
+          <w:tcPr>
+            <w:tcW w:type="dxa" w:w="1440"/>
+          </w:tcPr>
+          <w:p/>
+        </w:tc>
+        <w:tc>
+          <w:tcPr>
+            <w:tcW w:type="dxa" w:w="1440"/>
+          </w:tcPr>
+          <w:p/>
+        </w:tc>
+        <w:tc>
+          <w:tcPr>
+            <w:tcW w:type="dxa" w:w="1440"/>
+          </w:tcPr>
+          <w:p/>
+        </w:tc>
+        <w:tc>
+          <w:tcPr>
+            <w:tcW w:type="dxa" w:w="1440"/>
+          </w:tcPr>
+          <w:p/>
+        </w:tc>
+      </w:tr>
+    </w:tbl>
+    <w:p/>
+    <w:p>
+      <w:r>
+        <w:t>{%p endif %}</w:t>
+      </w:r>
+    </w:p>
+    <w:p>
+      <w:r>
+        <w:t>{%p if escenarios.hay_simulacion %}</w:t>
+      </w:r>
+    </w:p>
+    <w:p>
+      <w:pPr>
+        <w:pStyle w:val="Heading2"/>
+      </w:pPr>
+      <w:r>
+        <w:t>Simulación del plan completo por fases</w:t>
+      </w:r>
+    </w:p>
+    <w:p>
+      <w:r>
+        <w:t>Score de Citación actual: {{ escenarios.actual }}.</w:t>
+      </w:r>
+    </w:p>
+    <w:tbl>
+      <w:tblPr>
+        <w:tblStyle w:val="LightGrid-Accent1"/>
+        <w:tblW w:type="auto" w:w="0"/>
+        <w:tblLook w:firstColumn="1" w:firstRow="1" w:lastColumn="0" w:lastRow="0" w:noHBand="0" w:noVBand="1" w:val="04A0"/>
+      </w:tblPr>
+      <w:tblGrid>
+        <w:gridCol w:w="2880"/>
+        <w:gridCol w:w="2880"/>
+        <w:gridCol w:w="2880"/>
+      </w:tblGrid>
+      <w:tr>
+        <w:tc>
+          <w:tcPr>
+            <w:tcW w:type="dxa" w:w="2880"/>
+          </w:tcPr>
+          <w:p>
+            <w:r>
+              <w:t>Al terminar</w:t>
+            </w:r>
+          </w:p>
+        </w:tc>
+        <w:tc>
+          <w:tcPr>
+            <w:tcW w:type="dxa" w:w="2880"/>
+          </w:tcPr>
+          <w:p>
+            <w:r>
+              <w:t>Score proyectado [mín.–máx.]</w:t>
+            </w:r>
+          </w:p>
+        </w:tc>
+        <w:tc>
+          <w:tcPr>
+            <w:tcW w:type="dxa" w:w="2880"/>
+          </w:tcPr>
+          <w:p>
+            <w:r>
+              <w:t>Visibilidad espontánea [mín.–máx.]</w:t>
+            </w:r>
+          </w:p>
+        </w:tc>
+      </w:tr>
+      <w:tr>
+        <w:tc>
+          <w:tcPr>
+            <w:tcW w:type="dxa" w:w="2880"/>
+          </w:tcPr>
+          <w:p>
+            <w:r>
+              <w:t>{%tr for r in escenarios.fases %}</w:t>
+            </w:r>
+          </w:p>
+        </w:tc>
+        <w:tc>
+          <w:tcPr>
+            <w:tcW w:type="dxa" w:w="2880"/>
+          </w:tcPr>
+          <w:p/>
+        </w:tc>
+        <w:tc>
+          <w:tcPr>
+            <w:tcW w:type="dxa" w:w="2880"/>
+          </w:tcPr>
+          <w:p/>
+        </w:tc>
+      </w:tr>
+      <w:tr>
+        <w:tc>
+          <w:tcPr>
+            <w:tcW w:type="dxa" w:w="2880"/>
+          </w:tcPr>
+          <w:p>
+            <w:r>
+              <w:t>{{ r.fase }}</w:t>
+            </w:r>
+          </w:p>
+        </w:tc>
+        <w:tc>
+          <w:tcPr>
+            <w:tcW w:type="dxa" w:w="2880"/>
+          </w:tcPr>
+          <w:p>
+            <w:r>
+              <w:t>{{ r.score }}</w:t>
+            </w:r>
+          </w:p>
+        </w:tc>
+        <w:tc>
+          <w:tcPr>
+            <w:tcW w:type="dxa" w:w="2880"/>
+          </w:tcPr>
+          <w:p>
+            <w:r>
+              <w:t>{{ r.tasa }}</w:t>
+            </w:r>
+          </w:p>
+        </w:tc>
+      </w:tr>
+      <w:tr>
+        <w:tc>
+          <w:tcPr>
+            <w:tcW w:type="dxa" w:w="2880"/>
+          </w:tcPr>
+          <w:p>
+            <w:r>
+              <w:t>{%tr endfor %}</w:t>
+            </w:r>
+          </w:p>
+        </w:tc>
+        <w:tc>
+          <w:tcPr>
+            <w:tcW w:type="dxa" w:w="2880"/>
+          </w:tcPr>
+          <w:p/>
+        </w:tc>
+        <w:tc>
+          <w:tcPr>
+            <w:tcW w:type="dxa" w:w="2880"/>
+          </w:tcPr>
+          <w:p/>
+        </w:tc>
+      </w:tr>
+    </w:tbl>
+    <w:p/>
+    <w:p>
+      <w:pPr>
+        <w:pStyle w:val="Heading3"/>
+      </w:pPr>
+      <w:r>
+        <w:t>Supuestos</w:t>
+      </w:r>
+    </w:p>
+    <w:p>
+      <w:r>
+        <w:t>{%p for item in escenarios.supuestos %}</w:t>
+      </w:r>
+    </w:p>
+    <w:p>
+      <w:pPr>
+        <w:pStyle w:val="ListBullet"/>
+      </w:pPr>
+      <w:r>
+        <w:t>{{ item }}</w:t>
+      </w:r>
+    </w:p>
+    <w:p>
+      <w:r>
+        <w:t>{%p endfor %}</w:t>
+      </w:r>
+    </w:p>
+    <w:p>
+      <w:pPr>
+        <w:pStyle w:val="IntenseQuote"/>
+      </w:pPr>
+      <w:r>
+        <w:t>{{ escenarios.advertencia }}</w:t>
+      </w:r>
+    </w:p>
+    <w:p>
+      <w:r>
+        <w:t>Modelo de simulación: {{ escenarios.modelo }}.</w:t>
+      </w:r>
+    </w:p>
+    <w:p>
+      <w:r>
+        <w:t>{%p endif %}</w:t>
+      </w:r>
+    </w:p>
+    <w:p>
+      <w:r>
+        <w:t>{%p else %}</w:t>
+      </w:r>
+    </w:p>
+    <w:p>
+      <w:r>
+        <w:t>{{ escenarios.aviso }}</w:t>
+      </w:r>
+    </w:p>
+    <w:p>
+      <w:r>
+        <w:t>{%p endif %}</w:t>
+      </w:r>
+    </w:p>
+    <w:p>
+      <w:pPr>
+        <w:pStyle w:val="Heading1"/>
+      </w:pPr>
+      <w:r>
+        <w:t>11. Seguimiento con método</w:t>
+      </w:r>
+    </w:p>
+    <w:p>
+      <w:r>
+        <w:t>{{ seguimiento.intro }}</w:t>
+      </w:r>
+    </w:p>
+    <w:p>
+      <w:r>
+        <w:t>{%p for m in seguimiento.metodo %}</w:t>
+      </w:r>
+    </w:p>
+    <w:p>
+      <w:pPr>
+        <w:pStyle w:val="Heading3"/>
+      </w:pPr>
+      <w:r>
+        <w:t>{{ m.titulo }}</w:t>
+      </w:r>
+    </w:p>
+    <w:p>
+      <w:r>
+        <w:t>{{ m.texto }}</w:t>
+      </w:r>
+    </w:p>
+    <w:p>
+      <w:r>
+        <w:t>{%p endfor %}</w:t>
+      </w:r>
+    </w:p>
+    <w:p>
+      <w:pPr>
+        <w:pStyle w:val="Heading2"/>
+      </w:pPr>
+      <w:r>
+        <w:t>Línea base de este estudio</w:t>
+      </w:r>
+    </w:p>
+    <w:tbl>
+      <w:tblPr>
+        <w:tblStyle w:val="LightGrid-Accent1"/>
+        <w:tblW w:type="auto" w:w="0"/>
+        <w:tblLook w:firstColumn="1" w:firstRow="1" w:lastColumn="0" w:lastRow="0" w:noHBand="0" w:noVBand="1" w:val="04A0"/>
+      </w:tblPr>
+      <w:tblGrid>
+        <w:gridCol w:w="4320"/>
+        <w:gridCol w:w="4320"/>
+      </w:tblGrid>
+      <w:tr>
+        <w:tc>
+          <w:tcPr>
+            <w:tcW w:type="dxa" w:w="4320"/>
+          </w:tcPr>
+          <w:p>
+            <w:r>
+              <w:t>Indicador</w:t>
+            </w:r>
+          </w:p>
+        </w:tc>
+        <w:tc>
+          <w:tcPr>
+            <w:tcW w:type="dxa" w:w="4320"/>
+          </w:tcPr>
+          <w:p>
+            <w:r>
+              <w:t>Valor</w:t>
+            </w:r>
+          </w:p>
+        </w:tc>
+      </w:tr>
+      <w:tr>
+        <w:tc>
+          <w:tcPr>
+            <w:tcW w:type="dxa" w:w="4320"/>
+          </w:tcPr>
+          <w:p>
+            <w:r>
+              <w:t>{%tr for r in seguimiento.linea_base %}</w:t>
+            </w:r>
+          </w:p>
+        </w:tc>
+        <w:tc>
+          <w:tcPr>
+            <w:tcW w:type="dxa" w:w="4320"/>
+          </w:tcPr>
+          <w:p/>
+        </w:tc>
+      </w:tr>
+      <w:tr>
+        <w:tc>
+          <w:tcPr>
+            <w:tcW w:type="dxa" w:w="4320"/>
+          </w:tcPr>
+          <w:p>
+            <w:r>
+              <w:t>{{ r.campo }}</w:t>
+            </w:r>
+          </w:p>
+        </w:tc>
+        <w:tc>
+          <w:tcPr>
+            <w:tcW w:type="dxa" w:w="4320"/>
+          </w:tcPr>
+          <w:p>
+            <w:r>
+              <w:t>{{ r.valor }}</w:t>
+            </w:r>
+          </w:p>
+        </w:tc>
+      </w:tr>
+      <w:tr>
+        <w:tc>
+          <w:tcPr>
+            <w:tcW w:type="dxa" w:w="4320"/>
+          </w:tcPr>
+          <w:p>
+            <w:r>
+              <w:t>{%tr endfor %}</w:t>
+            </w:r>
+          </w:p>
+        </w:tc>
+        <w:tc>
+          <w:tcPr>
+            <w:tcW w:type="dxa" w:w="4320"/>
+          </w:tcPr>
+          <w:p/>
+        </w:tc>
+      </w:tr>
+    </w:tbl>
+    <w:p/>
+    <w:p>
+      <w:r>
+        <w:t>{%p if seguimiento.hay_remedicion %}</w:t>
+      </w:r>
+    </w:p>
+    <w:p>
+      <w:pPr>
+        <w:pStyle w:val="Heading2"/>
+      </w:pPr>
+      <w:r>
+        <w:t>Cambios fuera del margen frente a la medición anterior</w:t>
+      </w:r>
+    </w:p>
+    <w:tbl>
+      <w:tblPr>
+        <w:tblStyle w:val="LightGrid-Accent1"/>
+        <w:tblW w:type="auto" w:w="0"/>
+        <w:tblLook w:firstColumn="1" w:firstRow="1" w:lastColumn="0" w:lastRow="0" w:noHBand="0" w:noVBand="1" w:val="04A0"/>
+      </w:tblPr>
+      <w:tblGrid>
+        <w:gridCol w:w="2880"/>
+        <w:gridCol w:w="2880"/>
+        <w:gridCol w:w="2880"/>
+      </w:tblGrid>
+      <w:tr>
+        <w:tc>
+          <w:tcPr>
+            <w:tcW w:type="dxa" w:w="2880"/>
+          </w:tcPr>
+          <w:p>
+            <w:r>
+              <w:t>Indicador</w:t>
+            </w:r>
+          </w:p>
+        </w:tc>
+        <w:tc>
+          <w:tcPr>
+            <w:tcW w:type="dxa" w:w="2880"/>
+          </w:tcPr>
+          <w:p>
+            <w:r>
+              <w:t>Cambio</w:t>
+            </w:r>
+          </w:p>
+        </w:tc>
+        <w:tc>
+          <w:tcPr>
+            <w:tcW w:type="dxa" w:w="2880"/>
+          </w:tcPr>
+          <w:p>
+            <w:r>
+              <w:t>IC 95 % del cambio</w:t>
+            </w:r>
+          </w:p>
+        </w:tc>
+      </w:tr>
+      <w:tr>
+        <w:tc>
+          <w:tcPr>
+            <w:tcW w:type="dxa" w:w="2880"/>
+          </w:tcPr>
+          <w:p>
+            <w:r>
+              <w:t>{%tr for r in seguimiento.deltas %}</w:t>
+            </w:r>
+          </w:p>
+        </w:tc>
+        <w:tc>
+          <w:tcPr>
+            <w:tcW w:type="dxa" w:w="2880"/>
+          </w:tcPr>
+          <w:p/>
+        </w:tc>
+        <w:tc>
+          <w:tcPr>
+            <w:tcW w:type="dxa" w:w="2880"/>
+          </w:tcPr>
+          <w:p/>
+        </w:tc>
+      </w:tr>
+      <w:tr>
+        <w:tc>
+          <w:tcPr>
+            <w:tcW w:type="dxa" w:w="2880"/>
+          </w:tcPr>
+          <w:p>
+            <w:r>
+              <w:t>{{ r.indicador }}</w:t>
+            </w:r>
+          </w:p>
+        </w:tc>
+        <w:tc>
+          <w:tcPr>
+            <w:tcW w:type="dxa" w:w="2880"/>
+          </w:tcPr>
+          <w:p>
+            <w:r>
+              <w:t>{{ r.cambio }}</w:t>
+            </w:r>
+          </w:p>
+        </w:tc>
+        <w:tc>
+          <w:tcPr>
+            <w:tcW w:type="dxa" w:w="2880"/>
+          </w:tcPr>
+          <w:p>
+            <w:r>
+              <w:t>{{ r.ic }}</w:t>
+            </w:r>
+          </w:p>
+        </w:tc>
+      </w:tr>
+      <w:tr>
+        <w:tc>
+          <w:tcPr>
+            <w:tcW w:type="dxa" w:w="2880"/>
+          </w:tcPr>
+          <w:p>
+            <w:r>
+              <w:t>{%tr endfor %}</w:t>
+            </w:r>
+          </w:p>
+        </w:tc>
+        <w:tc>
+          <w:tcPr>
+            <w:tcW w:type="dxa" w:w="2880"/>
+          </w:tcPr>
+          <w:p/>
+        </w:tc>
+        <w:tc>
+          <w:tcPr>
+            <w:tcW w:type="dxa" w:w="2880"/>
+          </w:tcPr>
+          <w:p/>
+        </w:tc>
+      </w:tr>
+    </w:tbl>
+    <w:p/>
+    <w:p>
+      <w:r>
+        <w:t>{%p endif %}</w:t>
+      </w:r>
+    </w:p>
+    <w:p>
+      <w:pPr>
+        <w:pStyle w:val="Heading2"/>
+      </w:pPr>
+      <w:r>
+        <w:t>Indicadores y cadencia de esta propuesta</w:t>
       </w:r>
     </w:p>
     <w:p>
@@ -3493,7 +6452,7 @@
         <w:pStyle w:val="Heading1"/>
       </w:pPr>
       <w:r>
-        <w:t>10. Riesgos y supuestos</w:t>
+        <w:t>12. Riesgos y supuestos</w:t>
       </w:r>
     </w:p>
     <w:tbl>
@@ -3593,7 +6552,7 @@
         <w:pStyle w:val="Heading1"/>
       </w:pPr>
       <w:r>
-        <w:t>11. Hoja de ruta y presupuesto</w:t>
+        <w:t>13. Hoja de ruta y presupuesto</w:t>
       </w:r>
     </w:p>
     <w:p>

</xml_diff>

<commit_message>
feat(export): Word con el diferencial (rigor, competidores, fuentes, exactitud, escenarios, seguimiento) (#51)
DocxExporter/PdfExporter aceptan `diferencial` (DatosDiferencial.del_estado) y
GET /studies/{id}/export lo pasa desde el estado. 13 secciones; rotulo
«Caso sintetico del reto» en estudios kit; ejemplo regenerado.

Co-authored-by: Claude Opus 5.5 <noreply@anthropic.com>
</commit_message>
<xml_diff>
--- a/src/posiq/adapters/export/templates/propuesta.docx
+++ b/src/posiq/adapters/export/templates/propuesta.docx
@@ -22,13 +22,18 @@
     </w:p>
     <w:p>
       <w:r>
-        <w:t>{%p if aviso_sintetico %}</w:t>
+        <w:t>{%p if rotulo_sintetico %}</w:t>
       </w:r>
     </w:p>
     <w:p>
       <w:pPr>
         <w:pStyle w:val="IntenseQuote"/>
       </w:pPr>
+      <w:r>
+        <w:t>{{ rotulo_sintetico }}</w:t>
+      </w:r>
+    </w:p>
+    <w:p>
       <w:r>
         <w:t>{{ aviso_sintetico }}</w:t>
       </w:r>
@@ -2230,6 +2235,321 @@
     <w:p/>
     <w:p>
       <w:pPr>
+        <w:pStyle w:val="Heading2"/>
+      </w:pPr>
+      <w:r>
+        <w:t>Margen de error de las cifras</w:t>
+      </w:r>
+    </w:p>
+    <w:p>
+      <w:r>
+        <w:t>{%p if rigor.hay %}</w:t>
+      </w:r>
+    </w:p>
+    <w:p>
+      <w:r>
+        <w:t>{{ rigor.intro }}</w:t>
+      </w:r>
+    </w:p>
+    <w:tbl>
+      <w:tblPr>
+        <w:tblStyle w:val="LightList-Accent1"/>
+        <w:tblW w:type="auto" w:w="0"/>
+        <w:tblLook w:firstColumn="1" w:firstRow="1" w:lastColumn="0" w:lastRow="0" w:noHBand="0" w:noVBand="1" w:val="04A0"/>
+      </w:tblPr>
+      <w:tblGrid>
+        <w:gridCol w:w="4320"/>
+        <w:gridCol w:w="4320"/>
+      </w:tblGrid>
+      <w:tr>
+        <w:tc>
+          <w:tcPr>
+            <w:tcW w:type="dxa" w:w="4320"/>
+          </w:tcPr>
+          <w:p>
+            <w:r>
+              <w:t>Score de Citación [IC 95 %]</w:t>
+            </w:r>
+          </w:p>
+        </w:tc>
+        <w:tc>
+          <w:tcPr>
+            <w:tcW w:type="dxa" w:w="4320"/>
+          </w:tcPr>
+          <w:p>
+            <w:r>
+              <w:t>{{ rigor.score }}</w:t>
+            </w:r>
+          </w:p>
+        </w:tc>
+      </w:tr>
+      <w:tr>
+        <w:tc>
+          <w:tcPr>
+            <w:tcW w:type="dxa" w:w="4320"/>
+          </w:tcPr>
+          <w:p>
+            <w:r>
+              <w:t>Margen</w:t>
+            </w:r>
+          </w:p>
+        </w:tc>
+        <w:tc>
+          <w:tcPr>
+            <w:tcW w:type="dxa" w:w="4320"/>
+          </w:tcPr>
+          <w:p>
+            <w:r>
+              <w:t>{{ rigor.margen }}</w:t>
+            </w:r>
+          </w:p>
+        </w:tc>
+      </w:tr>
+      <w:tr>
+        <w:tc>
+          <w:tcPr>
+            <w:tcW w:type="dxa" w:w="4320"/>
+          </w:tcPr>
+          <w:p>
+            <w:r>
+              <w:t>Evaluaciones</w:t>
+            </w:r>
+          </w:p>
+        </w:tc>
+        <w:tc>
+          <w:tcPr>
+            <w:tcW w:type="dxa" w:w="4320"/>
+          </w:tcPr>
+          <w:p>
+            <w:r>
+              <w:t>{{ rigor.n }}</w:t>
+            </w:r>
+          </w:p>
+        </w:tc>
+      </w:tr>
+    </w:tbl>
+    <w:p/>
+    <w:p>
+      <w:pPr>
+        <w:pStyle w:val="Heading3"/>
+      </w:pPr>
+      <w:r>
+        <w:t>Aparición espontánea por motor, con su margen</w:t>
+      </w:r>
+    </w:p>
+    <w:tbl>
+      <w:tblPr>
+        <w:tblStyle w:val="LightGrid-Accent1"/>
+        <w:tblW w:type="auto" w:w="0"/>
+        <w:tblLook w:firstColumn="1" w:firstRow="1" w:lastColumn="0" w:lastRow="0" w:noHBand="0" w:noVBand="1" w:val="04A0"/>
+      </w:tblPr>
+      <w:tblGrid>
+        <w:gridCol w:w="1728"/>
+        <w:gridCol w:w="1728"/>
+        <w:gridCol w:w="1728"/>
+        <w:gridCol w:w="1728"/>
+        <w:gridCol w:w="1728"/>
+      </w:tblGrid>
+      <w:tr>
+        <w:tc>
+          <w:tcPr>
+            <w:tcW w:type="dxa" w:w="1728"/>
+          </w:tcPr>
+          <w:p>
+            <w:r>
+              <w:t>Motor</w:t>
+            </w:r>
+          </w:p>
+        </w:tc>
+        <w:tc>
+          <w:tcPr>
+            <w:tcW w:type="dxa" w:w="1728"/>
+          </w:tcPr>
+          <w:p>
+            <w:r>
+              <w:t>Aparición [IC 95 %]</w:t>
+            </w:r>
+          </w:p>
+        </w:tc>
+        <w:tc>
+          <w:tcPr>
+            <w:tcW w:type="dxa" w:w="1728"/>
+          </w:tcPr>
+          <w:p>
+            <w:r>
+              <w:t>Margen</w:t>
+            </w:r>
+          </w:p>
+        </w:tc>
+        <w:tc>
+          <w:tcPr>
+            <w:tcW w:type="dxa" w:w="1728"/>
+          </w:tcPr>
+          <w:p>
+            <w:r>
+              <w:t>Respuestas</w:t>
+            </w:r>
+          </w:p>
+        </w:tc>
+        <w:tc>
+          <w:tcPr>
+            <w:tcW w:type="dxa" w:w="1728"/>
+          </w:tcPr>
+          <w:p>
+            <w:r>
+              <w:t>Score del motor [IC 95 %]</w:t>
+            </w:r>
+          </w:p>
+        </w:tc>
+      </w:tr>
+      <w:tr>
+        <w:tc>
+          <w:tcPr>
+            <w:tcW w:type="dxa" w:w="1728"/>
+          </w:tcPr>
+          <w:p>
+            <w:r>
+              <w:t>{%tr for r in rigor.motores %}</w:t>
+            </w:r>
+          </w:p>
+        </w:tc>
+        <w:tc>
+          <w:tcPr>
+            <w:tcW w:type="dxa" w:w="1728"/>
+          </w:tcPr>
+          <w:p/>
+        </w:tc>
+        <w:tc>
+          <w:tcPr>
+            <w:tcW w:type="dxa" w:w="1728"/>
+          </w:tcPr>
+          <w:p/>
+        </w:tc>
+        <w:tc>
+          <w:tcPr>
+            <w:tcW w:type="dxa" w:w="1728"/>
+          </w:tcPr>
+          <w:p/>
+        </w:tc>
+        <w:tc>
+          <w:tcPr>
+            <w:tcW w:type="dxa" w:w="1728"/>
+          </w:tcPr>
+          <w:p/>
+        </w:tc>
+      </w:tr>
+      <w:tr>
+        <w:tc>
+          <w:tcPr>
+            <w:tcW w:type="dxa" w:w="1728"/>
+          </w:tcPr>
+          <w:p>
+            <w:r>
+              <w:t>{{ r.motor }}</w:t>
+            </w:r>
+          </w:p>
+        </w:tc>
+        <w:tc>
+          <w:tcPr>
+            <w:tcW w:type="dxa" w:w="1728"/>
+          </w:tcPr>
+          <w:p>
+            <w:r>
+              <w:t>{{ r.aparicion }}</w:t>
+            </w:r>
+          </w:p>
+        </w:tc>
+        <w:tc>
+          <w:tcPr>
+            <w:tcW w:type="dxa" w:w="1728"/>
+          </w:tcPr>
+          <w:p>
+            <w:r>
+              <w:t>{{ r.margen }}</w:t>
+            </w:r>
+          </w:p>
+        </w:tc>
+        <w:tc>
+          <w:tcPr>
+            <w:tcW w:type="dxa" w:w="1728"/>
+          </w:tcPr>
+          <w:p>
+            <w:r>
+              <w:t>{{ r.n }}</w:t>
+            </w:r>
+          </w:p>
+        </w:tc>
+        <w:tc>
+          <w:tcPr>
+            <w:tcW w:type="dxa" w:w="1728"/>
+          </w:tcPr>
+          <w:p>
+            <w:r>
+              <w:t>{{ r.score }}</w:t>
+            </w:r>
+          </w:p>
+        </w:tc>
+      </w:tr>
+      <w:tr>
+        <w:tc>
+          <w:tcPr>
+            <w:tcW w:type="dxa" w:w="1728"/>
+          </w:tcPr>
+          <w:p>
+            <w:r>
+              <w:t>{%tr endfor %}</w:t>
+            </w:r>
+          </w:p>
+        </w:tc>
+        <w:tc>
+          <w:tcPr>
+            <w:tcW w:type="dxa" w:w="1728"/>
+          </w:tcPr>
+          <w:p/>
+        </w:tc>
+        <w:tc>
+          <w:tcPr>
+            <w:tcW w:type="dxa" w:w="1728"/>
+          </w:tcPr>
+          <w:p/>
+        </w:tc>
+        <w:tc>
+          <w:tcPr>
+            <w:tcW w:type="dxa" w:w="1728"/>
+          </w:tcPr>
+          <w:p/>
+        </w:tc>
+        <w:tc>
+          <w:tcPr>
+            <w:tcW w:type="dxa" w:w="1728"/>
+          </w:tcPr>
+          <w:p/>
+        </w:tc>
+      </w:tr>
+    </w:tbl>
+    <w:p/>
+    <w:p>
+      <w:r>
+        <w:t>{{ rigor.metodo }}</w:t>
+      </w:r>
+    </w:p>
+    <w:p>
+      <w:r>
+        <w:t>{%p else %}</w:t>
+      </w:r>
+    </w:p>
+    <w:p>
+      <w:r>
+        <w:t>{{ rigor.aviso }}</w:t>
+      </w:r>
+    </w:p>
+    <w:p>
+      <w:r>
+        <w:t>{%p endif %}</w:t>
+      </w:r>
+    </w:p>
+    <w:p>
+      <w:pPr>
         <w:pStyle w:val="Heading1"/>
       </w:pPr>
       <w:r>
@@ -2651,6 +2971,836 @@
     <w:p/>
     <w:p>
       <w:pPr>
+        <w:pStyle w:val="Heading2"/>
+      </w:pPr>
+      <w:r>
+        <w:t>Competidores declarados frente a los que pone la IA</w:t>
+      </w:r>
+    </w:p>
+    <w:p>
+      <w:r>
+        <w:t>{%p if rivales.hay %}</w:t>
+      </w:r>
+    </w:p>
+    <w:p>
+      <w:r>
+        <w:t>{{ rivales.intro }}</w:t>
+      </w:r>
+    </w:p>
+    <w:p>
+      <w:r>
+        <w:t>{{ rivales.foco }}</w:t>
+      </w:r>
+    </w:p>
+    <w:p>
+      <w:pPr>
+        <w:pStyle w:val="Heading3"/>
+      </w:pPr>
+      <w:r>
+        <w:t>Los que declara el brief</w:t>
+      </w:r>
+    </w:p>
+    <w:tbl>
+      <w:tblPr>
+        <w:tblStyle w:val="LightGrid-Accent1"/>
+        <w:tblW w:type="auto" w:w="0"/>
+        <w:tblLook w:firstColumn="1" w:firstRow="1" w:lastColumn="0" w:lastRow="0" w:noHBand="0" w:noVBand="1" w:val="04A0"/>
+      </w:tblPr>
+      <w:tblGrid>
+        <w:gridCol w:w="1440"/>
+        <w:gridCol w:w="1440"/>
+        <w:gridCol w:w="1440"/>
+        <w:gridCol w:w="1440"/>
+        <w:gridCol w:w="1440"/>
+        <w:gridCol w:w="1440"/>
+      </w:tblGrid>
+      <w:tr>
+        <w:tc>
+          <w:tcPr>
+            <w:tcW w:type="dxa" w:w="1440"/>
+          </w:tcPr>
+          <w:p>
+            <w:r>
+              <w:t>Marca</w:t>
+            </w:r>
+          </w:p>
+        </w:tc>
+        <w:tc>
+          <w:tcPr>
+            <w:tcW w:type="dxa" w:w="1440"/>
+          </w:tcPr>
+          <w:p>
+            <w:r>
+              <w:t>Posición</w:t>
+            </w:r>
+          </w:p>
+        </w:tc>
+        <w:tc>
+          <w:tcPr>
+            <w:tcW w:type="dxa" w:w="1440"/>
+          </w:tcPr>
+          <w:p>
+            <w:r>
+              <w:t>Score</w:t>
+            </w:r>
+          </w:p>
+        </w:tc>
+        <w:tc>
+          <w:tcPr>
+            <w:tcW w:type="dxa" w:w="1440"/>
+          </w:tcPr>
+          <w:p>
+            <w:r>
+              <w:t>Ventaja sobre la marca</w:t>
+            </w:r>
+          </w:p>
+        </w:tc>
+        <w:tc>
+          <w:tcPr>
+            <w:tcW w:type="dxa" w:w="1440"/>
+          </w:tcPr>
+          <w:p>
+            <w:r>
+              <w:t>Visib. espontánea</w:t>
+            </w:r>
+          </w:p>
+        </w:tc>
+        <w:tc>
+          <w:tcPr>
+            <w:tcW w:type="dxa" w:w="1440"/>
+          </w:tcPr>
+          <w:p>
+            <w:r>
+              <w:t>Nota</w:t>
+            </w:r>
+          </w:p>
+        </w:tc>
+      </w:tr>
+      <w:tr>
+        <w:tc>
+          <w:tcPr>
+            <w:tcW w:type="dxa" w:w="1440"/>
+          </w:tcPr>
+          <w:p>
+            <w:r>
+              <w:t>{%tr for r in rivales.declarados %}</w:t>
+            </w:r>
+          </w:p>
+        </w:tc>
+        <w:tc>
+          <w:tcPr>
+            <w:tcW w:type="dxa" w:w="1440"/>
+          </w:tcPr>
+          <w:p/>
+        </w:tc>
+        <w:tc>
+          <w:tcPr>
+            <w:tcW w:type="dxa" w:w="1440"/>
+          </w:tcPr>
+          <w:p/>
+        </w:tc>
+        <w:tc>
+          <w:tcPr>
+            <w:tcW w:type="dxa" w:w="1440"/>
+          </w:tcPr>
+          <w:p/>
+        </w:tc>
+        <w:tc>
+          <w:tcPr>
+            <w:tcW w:type="dxa" w:w="1440"/>
+          </w:tcPr>
+          <w:p/>
+        </w:tc>
+        <w:tc>
+          <w:tcPr>
+            <w:tcW w:type="dxa" w:w="1440"/>
+          </w:tcPr>
+          <w:p/>
+        </w:tc>
+      </w:tr>
+      <w:tr>
+        <w:tc>
+          <w:tcPr>
+            <w:tcW w:type="dxa" w:w="1440"/>
+          </w:tcPr>
+          <w:p>
+            <w:r>
+              <w:t>{{ r.marca }}</w:t>
+            </w:r>
+          </w:p>
+        </w:tc>
+        <w:tc>
+          <w:tcPr>
+            <w:tcW w:type="dxa" w:w="1440"/>
+          </w:tcPr>
+          <w:p>
+            <w:r>
+              <w:t>{{ r.puesto }}</w:t>
+            </w:r>
+          </w:p>
+        </w:tc>
+        <w:tc>
+          <w:tcPr>
+            <w:tcW w:type="dxa" w:w="1440"/>
+          </w:tcPr>
+          <w:p>
+            <w:r>
+              <w:t>{{ r.score }}</w:t>
+            </w:r>
+          </w:p>
+        </w:tc>
+        <w:tc>
+          <w:tcPr>
+            <w:tcW w:type="dxa" w:w="1440"/>
+          </w:tcPr>
+          <w:p>
+            <w:r>
+              <w:t>{{ r.ventaja }}</w:t>
+            </w:r>
+          </w:p>
+        </w:tc>
+        <w:tc>
+          <w:tcPr>
+            <w:tcW w:type="dxa" w:w="1440"/>
+          </w:tcPr>
+          <w:p>
+            <w:r>
+              <w:t>{{ r.tasa }}</w:t>
+            </w:r>
+          </w:p>
+        </w:tc>
+        <w:tc>
+          <w:tcPr>
+            <w:tcW w:type="dxa" w:w="1440"/>
+          </w:tcPr>
+          <w:p>
+            <w:r>
+              <w:t>{{ r.nota }}</w:t>
+            </w:r>
+          </w:p>
+        </w:tc>
+      </w:tr>
+      <w:tr>
+        <w:tc>
+          <w:tcPr>
+            <w:tcW w:type="dxa" w:w="1440"/>
+          </w:tcPr>
+          <w:p>
+            <w:r>
+              <w:t>{%tr endfor %}</w:t>
+            </w:r>
+          </w:p>
+        </w:tc>
+        <w:tc>
+          <w:tcPr>
+            <w:tcW w:type="dxa" w:w="1440"/>
+          </w:tcPr>
+          <w:p/>
+        </w:tc>
+        <w:tc>
+          <w:tcPr>
+            <w:tcW w:type="dxa" w:w="1440"/>
+          </w:tcPr>
+          <w:p/>
+        </w:tc>
+        <w:tc>
+          <w:tcPr>
+            <w:tcW w:type="dxa" w:w="1440"/>
+          </w:tcPr>
+          <w:p/>
+        </w:tc>
+        <w:tc>
+          <w:tcPr>
+            <w:tcW w:type="dxa" w:w="1440"/>
+          </w:tcPr>
+          <w:p/>
+        </w:tc>
+        <w:tc>
+          <w:tcPr>
+            <w:tcW w:type="dxa" w:w="1440"/>
+          </w:tcPr>
+          <w:p/>
+        </w:tc>
+      </w:tr>
+    </w:tbl>
+    <w:p/>
+    <w:p>
+      <w:pPr>
+        <w:pStyle w:val="Heading3"/>
+      </w:pPr>
+      <w:r>
+        <w:t>Los que la IA pone por delante y el brief no declara</w:t>
+      </w:r>
+    </w:p>
+    <w:tbl>
+      <w:tblPr>
+        <w:tblStyle w:val="LightGrid-Accent1"/>
+        <w:tblW w:type="auto" w:w="0"/>
+        <w:tblLook w:firstColumn="1" w:firstRow="1" w:lastColumn="0" w:lastRow="0" w:noHBand="0" w:noVBand="1" w:val="04A0"/>
+      </w:tblPr>
+      <w:tblGrid>
+        <w:gridCol w:w="1440"/>
+        <w:gridCol w:w="1440"/>
+        <w:gridCol w:w="1440"/>
+        <w:gridCol w:w="1440"/>
+        <w:gridCol w:w="1440"/>
+        <w:gridCol w:w="1440"/>
+      </w:tblGrid>
+      <w:tr>
+        <w:tc>
+          <w:tcPr>
+            <w:tcW w:type="dxa" w:w="1440"/>
+          </w:tcPr>
+          <w:p>
+            <w:r>
+              <w:t>Marca</w:t>
+            </w:r>
+          </w:p>
+        </w:tc>
+        <w:tc>
+          <w:tcPr>
+            <w:tcW w:type="dxa" w:w="1440"/>
+          </w:tcPr>
+          <w:p>
+            <w:r>
+              <w:t>Posición</w:t>
+            </w:r>
+          </w:p>
+        </w:tc>
+        <w:tc>
+          <w:tcPr>
+            <w:tcW w:type="dxa" w:w="1440"/>
+          </w:tcPr>
+          <w:p>
+            <w:r>
+              <w:t>Score</w:t>
+            </w:r>
+          </w:p>
+        </w:tc>
+        <w:tc>
+          <w:tcPr>
+            <w:tcW w:type="dxa" w:w="1440"/>
+          </w:tcPr>
+          <w:p>
+            <w:r>
+              <w:t>Ventaja sobre la marca</w:t>
+            </w:r>
+          </w:p>
+        </w:tc>
+        <w:tc>
+          <w:tcPr>
+            <w:tcW w:type="dxa" w:w="1440"/>
+          </w:tcPr>
+          <w:p>
+            <w:r>
+              <w:t>Visib. espontánea</w:t>
+            </w:r>
+          </w:p>
+        </w:tc>
+        <w:tc>
+          <w:tcPr>
+            <w:tcW w:type="dxa" w:w="1440"/>
+          </w:tcPr>
+          <w:p>
+            <w:r>
+              <w:t>Nota</w:t>
+            </w:r>
+          </w:p>
+        </w:tc>
+      </w:tr>
+      <w:tr>
+        <w:tc>
+          <w:tcPr>
+            <w:tcW w:type="dxa" w:w="1440"/>
+          </w:tcPr>
+          <w:p>
+            <w:r>
+              <w:t>{%tr for r in rivales.por_delante %}</w:t>
+            </w:r>
+          </w:p>
+        </w:tc>
+        <w:tc>
+          <w:tcPr>
+            <w:tcW w:type="dxa" w:w="1440"/>
+          </w:tcPr>
+          <w:p/>
+        </w:tc>
+        <w:tc>
+          <w:tcPr>
+            <w:tcW w:type="dxa" w:w="1440"/>
+          </w:tcPr>
+          <w:p/>
+        </w:tc>
+        <w:tc>
+          <w:tcPr>
+            <w:tcW w:type="dxa" w:w="1440"/>
+          </w:tcPr>
+          <w:p/>
+        </w:tc>
+        <w:tc>
+          <w:tcPr>
+            <w:tcW w:type="dxa" w:w="1440"/>
+          </w:tcPr>
+          <w:p/>
+        </w:tc>
+        <w:tc>
+          <w:tcPr>
+            <w:tcW w:type="dxa" w:w="1440"/>
+          </w:tcPr>
+          <w:p/>
+        </w:tc>
+      </w:tr>
+      <w:tr>
+        <w:tc>
+          <w:tcPr>
+            <w:tcW w:type="dxa" w:w="1440"/>
+          </w:tcPr>
+          <w:p>
+            <w:r>
+              <w:t>{{ r.marca }}</w:t>
+            </w:r>
+          </w:p>
+        </w:tc>
+        <w:tc>
+          <w:tcPr>
+            <w:tcW w:type="dxa" w:w="1440"/>
+          </w:tcPr>
+          <w:p>
+            <w:r>
+              <w:t>{{ r.puesto }}</w:t>
+            </w:r>
+          </w:p>
+        </w:tc>
+        <w:tc>
+          <w:tcPr>
+            <w:tcW w:type="dxa" w:w="1440"/>
+          </w:tcPr>
+          <w:p>
+            <w:r>
+              <w:t>{{ r.score }}</w:t>
+            </w:r>
+          </w:p>
+        </w:tc>
+        <w:tc>
+          <w:tcPr>
+            <w:tcW w:type="dxa" w:w="1440"/>
+          </w:tcPr>
+          <w:p>
+            <w:r>
+              <w:t>{{ r.ventaja }}</w:t>
+            </w:r>
+          </w:p>
+        </w:tc>
+        <w:tc>
+          <w:tcPr>
+            <w:tcW w:type="dxa" w:w="1440"/>
+          </w:tcPr>
+          <w:p>
+            <w:r>
+              <w:t>{{ r.tasa }}</w:t>
+            </w:r>
+          </w:p>
+        </w:tc>
+        <w:tc>
+          <w:tcPr>
+            <w:tcW w:type="dxa" w:w="1440"/>
+          </w:tcPr>
+          <w:p>
+            <w:r>
+              <w:t>{{ r.nota }}</w:t>
+            </w:r>
+          </w:p>
+        </w:tc>
+      </w:tr>
+      <w:tr>
+        <w:tc>
+          <w:tcPr>
+            <w:tcW w:type="dxa" w:w="1440"/>
+          </w:tcPr>
+          <w:p>
+            <w:r>
+              <w:t>{%tr endfor %}</w:t>
+            </w:r>
+          </w:p>
+        </w:tc>
+        <w:tc>
+          <w:tcPr>
+            <w:tcW w:type="dxa" w:w="1440"/>
+          </w:tcPr>
+          <w:p/>
+        </w:tc>
+        <w:tc>
+          <w:tcPr>
+            <w:tcW w:type="dxa" w:w="1440"/>
+          </w:tcPr>
+          <w:p/>
+        </w:tc>
+        <w:tc>
+          <w:tcPr>
+            <w:tcW w:type="dxa" w:w="1440"/>
+          </w:tcPr>
+          <w:p/>
+        </w:tc>
+        <w:tc>
+          <w:tcPr>
+            <w:tcW w:type="dxa" w:w="1440"/>
+          </w:tcPr>
+          <w:p/>
+        </w:tc>
+        <w:tc>
+          <w:tcPr>
+            <w:tcW w:type="dxa" w:w="1440"/>
+          </w:tcPr>
+          <w:p/>
+        </w:tc>
+      </w:tr>
+    </w:tbl>
+    <w:p/>
+    <w:p>
+      <w:r>
+        <w:t>{{ rivales.umbral }}</w:t>
+      </w:r>
+    </w:p>
+    <w:p>
+      <w:r>
+        <w:t>{%p for item in rivales.notas %}</w:t>
+      </w:r>
+    </w:p>
+    <w:p>
+      <w:pPr>
+        <w:pStyle w:val="ListBullet"/>
+      </w:pPr>
+      <w:r>
+        <w:t>{{ item }}</w:t>
+      </w:r>
+    </w:p>
+    <w:p>
+      <w:r>
+        <w:t>{%p endfor %}</w:t>
+      </w:r>
+    </w:p>
+    <w:p>
+      <w:r>
+        <w:t>{%p else %}</w:t>
+      </w:r>
+    </w:p>
+    <w:p>
+      <w:r>
+        <w:t>{{ rivales.aviso }}</w:t>
+      </w:r>
+    </w:p>
+    <w:p>
+      <w:r>
+        <w:t>{%p endif %}</w:t>
+      </w:r>
+    </w:p>
+    <w:p>
+      <w:pPr>
+        <w:pStyle w:val="Heading2"/>
+      </w:pPr>
+      <w:r>
+        <w:t>Mapa de fuentes y oportunidades</w:t>
+      </w:r>
+    </w:p>
+    <w:p>
+      <w:r>
+        <w:t>{%p if fuentes_op.hay %}</w:t>
+      </w:r>
+    </w:p>
+    <w:p>
+      <w:r>
+        <w:t>{{ fuentes_op.intro }}</w:t>
+      </w:r>
+    </w:p>
+    <w:tbl>
+      <w:tblPr>
+        <w:tblStyle w:val="LightGrid-Accent1"/>
+        <w:tblW w:type="auto" w:w="0"/>
+        <w:tblLook w:firstColumn="1" w:firstRow="1" w:lastColumn="0" w:lastRow="0" w:noHBand="0" w:noVBand="1" w:val="04A0"/>
+      </w:tblPr>
+      <w:tblGrid>
+        <w:gridCol w:w="1234"/>
+        <w:gridCol w:w="1234"/>
+        <w:gridCol w:w="1234"/>
+        <w:gridCol w:w="1234"/>
+        <w:gridCol w:w="1234"/>
+        <w:gridCol w:w="1234"/>
+        <w:gridCol w:w="1234"/>
+      </w:tblGrid>
+      <w:tr>
+        <w:tc>
+          <w:tcPr>
+            <w:tcW w:type="dxa" w:w="1234"/>
+          </w:tcPr>
+          <w:p>
+            <w:r>
+              <w:t>Fuente</w:t>
+            </w:r>
+          </w:p>
+        </w:tc>
+        <w:tc>
+          <w:tcPr>
+            <w:tcW w:type="dxa" w:w="1234"/>
+          </w:tcPr>
+          <w:p>
+            <w:r>
+              <w:t>Tipo</w:t>
+            </w:r>
+          </w:p>
+        </w:tc>
+        <w:tc>
+          <w:tcPr>
+            <w:tcW w:type="dxa" w:w="1234"/>
+          </w:tcPr>
+          <w:p>
+            <w:r>
+              <w:t>Cuota del sector</w:t>
+            </w:r>
+          </w:p>
+        </w:tc>
+        <w:tc>
+          <w:tcPr>
+            <w:tcW w:type="dxa" w:w="1234"/>
+          </w:tcPr>
+          <w:p>
+            <w:r>
+              <w:t>Con la marca</w:t>
+            </w:r>
+          </w:p>
+        </w:tc>
+        <w:tc>
+          <w:tcPr>
+            <w:tcW w:type="dxa" w:w="1234"/>
+          </w:tcPr>
+          <w:p>
+            <w:r>
+              <w:t>Con competidores</w:t>
+            </w:r>
+          </w:p>
+        </w:tc>
+        <w:tc>
+          <w:tcPr>
+            <w:tcW w:type="dxa" w:w="1234"/>
+          </w:tcPr>
+          <w:p>
+            <w:r>
+              <w:t>Brecha</w:t>
+            </w:r>
+          </w:p>
+        </w:tc>
+        <w:tc>
+          <w:tcPr>
+            <w:tcW w:type="dxa" w:w="1234"/>
+          </w:tcPr>
+          <w:p>
+            <w:r>
+              <w:t>Prioridad</w:t>
+            </w:r>
+          </w:p>
+        </w:tc>
+      </w:tr>
+      <w:tr>
+        <w:tc>
+          <w:tcPr>
+            <w:tcW w:type="dxa" w:w="1234"/>
+          </w:tcPr>
+          <w:p>
+            <w:r>
+              <w:t>{%tr for r in fuentes_op.filas %}</w:t>
+            </w:r>
+          </w:p>
+        </w:tc>
+        <w:tc>
+          <w:tcPr>
+            <w:tcW w:type="dxa" w:w="1234"/>
+          </w:tcPr>
+          <w:p/>
+        </w:tc>
+        <w:tc>
+          <w:tcPr>
+            <w:tcW w:type="dxa" w:w="1234"/>
+          </w:tcPr>
+          <w:p/>
+        </w:tc>
+        <w:tc>
+          <w:tcPr>
+            <w:tcW w:type="dxa" w:w="1234"/>
+          </w:tcPr>
+          <w:p/>
+        </w:tc>
+        <w:tc>
+          <w:tcPr>
+            <w:tcW w:type="dxa" w:w="1234"/>
+          </w:tcPr>
+          <w:p/>
+        </w:tc>
+        <w:tc>
+          <w:tcPr>
+            <w:tcW w:type="dxa" w:w="1234"/>
+          </w:tcPr>
+          <w:p/>
+        </w:tc>
+        <w:tc>
+          <w:tcPr>
+            <w:tcW w:type="dxa" w:w="1234"/>
+          </w:tcPr>
+          <w:p/>
+        </w:tc>
+      </w:tr>
+      <w:tr>
+        <w:tc>
+          <w:tcPr>
+            <w:tcW w:type="dxa" w:w="1234"/>
+          </w:tcPr>
+          <w:p>
+            <w:r>
+              <w:t>{{ r.fuente }}</w:t>
+            </w:r>
+          </w:p>
+        </w:tc>
+        <w:tc>
+          <w:tcPr>
+            <w:tcW w:type="dxa" w:w="1234"/>
+          </w:tcPr>
+          <w:p>
+            <w:r>
+              <w:t>{{ r.tipo }}</w:t>
+            </w:r>
+          </w:p>
+        </w:tc>
+        <w:tc>
+          <w:tcPr>
+            <w:tcW w:type="dxa" w:w="1234"/>
+          </w:tcPr>
+          <w:p>
+            <w:r>
+              <w:t>{{ r.cuota }}</w:t>
+            </w:r>
+          </w:p>
+        </w:tc>
+        <w:tc>
+          <w:tcPr>
+            <w:tcW w:type="dxa" w:w="1234"/>
+          </w:tcPr>
+          <w:p>
+            <w:r>
+              <w:t>{{ r.marca }}</w:t>
+            </w:r>
+          </w:p>
+        </w:tc>
+        <w:tc>
+          <w:tcPr>
+            <w:tcW w:type="dxa" w:w="1234"/>
+          </w:tcPr>
+          <w:p>
+            <w:r>
+              <w:t>{{ r.competidores }}</w:t>
+            </w:r>
+          </w:p>
+        </w:tc>
+        <w:tc>
+          <w:tcPr>
+            <w:tcW w:type="dxa" w:w="1234"/>
+          </w:tcPr>
+          <w:p>
+            <w:r>
+              <w:t>{{ r.brecha }}</w:t>
+            </w:r>
+          </w:p>
+        </w:tc>
+        <w:tc>
+          <w:tcPr>
+            <w:tcW w:type="dxa" w:w="1234"/>
+          </w:tcPr>
+          <w:p>
+            <w:r>
+              <w:t>{{ r.prioridad }}</w:t>
+            </w:r>
+          </w:p>
+        </w:tc>
+      </w:tr>
+      <w:tr>
+        <w:tc>
+          <w:tcPr>
+            <w:tcW w:type="dxa" w:w="1234"/>
+          </w:tcPr>
+          <w:p>
+            <w:r>
+              <w:t>{%tr endfor %}</w:t>
+            </w:r>
+          </w:p>
+        </w:tc>
+        <w:tc>
+          <w:tcPr>
+            <w:tcW w:type="dxa" w:w="1234"/>
+          </w:tcPr>
+          <w:p/>
+        </w:tc>
+        <w:tc>
+          <w:tcPr>
+            <w:tcW w:type="dxa" w:w="1234"/>
+          </w:tcPr>
+          <w:p/>
+        </w:tc>
+        <w:tc>
+          <w:tcPr>
+            <w:tcW w:type="dxa" w:w="1234"/>
+          </w:tcPr>
+          <w:p/>
+        </w:tc>
+        <w:tc>
+          <w:tcPr>
+            <w:tcW w:type="dxa" w:w="1234"/>
+          </w:tcPr>
+          <w:p/>
+        </w:tc>
+        <w:tc>
+          <w:tcPr>
+            <w:tcW w:type="dxa" w:w="1234"/>
+          </w:tcPr>
+          <w:p/>
+        </w:tc>
+        <w:tc>
+          <w:tcPr>
+            <w:tcW w:type="dxa" w:w="1234"/>
+          </w:tcPr>
+          <w:p/>
+        </w:tc>
+      </w:tr>
+    </w:tbl>
+    <w:p/>
+    <w:p>
+      <w:r>
+        <w:t>{%p if fuentes_op.resto %}</w:t>
+      </w:r>
+    </w:p>
+    <w:p>
+      <w:r>
+        <w:t>{{ fuentes_op.resto }}</w:t>
+      </w:r>
+    </w:p>
+    <w:p>
+      <w:r>
+        <w:t>{%p endif %}</w:t>
+      </w:r>
+    </w:p>
+    <w:p>
+      <w:r>
+        <w:t>{%p else %}</w:t>
+      </w:r>
+    </w:p>
+    <w:p>
+      <w:r>
+        <w:t>{{ fuentes_op.aviso }}</w:t>
+      </w:r>
+    </w:p>
+    <w:p>
+      <w:r>
+        <w:t>{%p endif %}</w:t>
+      </w:r>
+    </w:p>
+    <w:p>
+      <w:pPr>
         <w:pStyle w:val="Heading1"/>
       </w:pPr>
       <w:r>
@@ -2817,6 +3967,28 @@
           </w:p>
         </w:tc>
       </w:tr>
+      <w:tr>
+        <w:tc>
+          <w:tcPr>
+            <w:tcW w:type="dxa" w:w="4320"/>
+          </w:tcPr>
+          <w:p>
+            <w:r>
+              <w:t>Contraste estadístico</w:t>
+            </w:r>
+          </w:p>
+        </w:tc>
+        <w:tc>
+          <w:tcPr>
+            <w:tcW w:type="dxa" w:w="4320"/>
+          </w:tcPr>
+          <w:p>
+            <w:r>
+              <w:t>{{ h.contraste }}</w:t>
+            </w:r>
+          </w:p>
+        </w:tc>
+      </w:tr>
     </w:tbl>
     <w:p/>
     <w:p>
@@ -2829,7 +4001,1061 @@
         <w:pStyle w:val="Heading1"/>
       </w:pPr>
       <w:r>
-        <w:t>7. Estrategia recomendada</w:t>
+        <w:t>7. Exactitud y lectura técnica de la marca</w:t>
+      </w:r>
+    </w:p>
+    <w:p>
+      <w:pPr>
+        <w:pStyle w:val="Heading2"/>
+      </w:pPr>
+      <w:r>
+        <w:t>Lo que dicen los motores de la marca</w:t>
+      </w:r>
+    </w:p>
+    <w:p>
+      <w:r>
+        <w:t>{%p if exactitud.hay %}</w:t>
+      </w:r>
+    </w:p>
+    <w:p>
+      <w:r>
+        <w:t>{{ exactitud.intro }}</w:t>
+      </w:r>
+    </w:p>
+    <w:tbl>
+      <w:tblPr>
+        <w:tblStyle w:val="LightGrid-Accent1"/>
+        <w:tblW w:type="auto" w:w="0"/>
+        <w:tblLook w:firstColumn="1" w:firstRow="1" w:lastColumn="0" w:lastRow="0" w:noHBand="0" w:noVBand="1" w:val="04A0"/>
+      </w:tblPr>
+      <w:tblGrid>
+        <w:gridCol w:w="4320"/>
+        <w:gridCol w:w="4320"/>
+      </w:tblGrid>
+      <w:tr>
+        <w:tc>
+          <w:tcPr>
+            <w:tcW w:type="dxa" w:w="4320"/>
+          </w:tcPr>
+          <w:p>
+            <w:r>
+              <w:t>Afirmaciones</w:t>
+            </w:r>
+          </w:p>
+        </w:tc>
+        <w:tc>
+          <w:tcPr>
+            <w:tcW w:type="dxa" w:w="4320"/>
+          </w:tcPr>
+          <w:p>
+            <w:r>
+              <w:t>Número</w:t>
+            </w:r>
+          </w:p>
+        </w:tc>
+      </w:tr>
+      <w:tr>
+        <w:tc>
+          <w:tcPr>
+            <w:tcW w:type="dxa" w:w="4320"/>
+          </w:tcPr>
+          <w:p>
+            <w:r>
+              <w:t>{%tr for r in exactitud.resumen %}</w:t>
+            </w:r>
+          </w:p>
+        </w:tc>
+        <w:tc>
+          <w:tcPr>
+            <w:tcW w:type="dxa" w:w="4320"/>
+          </w:tcPr>
+          <w:p/>
+        </w:tc>
+      </w:tr>
+      <w:tr>
+        <w:tc>
+          <w:tcPr>
+            <w:tcW w:type="dxa" w:w="4320"/>
+          </w:tcPr>
+          <w:p>
+            <w:r>
+              <w:t>{{ r.campo }}</w:t>
+            </w:r>
+          </w:p>
+        </w:tc>
+        <w:tc>
+          <w:tcPr>
+            <w:tcW w:type="dxa" w:w="4320"/>
+          </w:tcPr>
+          <w:p>
+            <w:r>
+              <w:t>{{ r.valor }}</w:t>
+            </w:r>
+          </w:p>
+        </w:tc>
+      </w:tr>
+      <w:tr>
+        <w:tc>
+          <w:tcPr>
+            <w:tcW w:type="dxa" w:w="4320"/>
+          </w:tcPr>
+          <w:p>
+            <w:r>
+              <w:t>{%tr endfor %}</w:t>
+            </w:r>
+          </w:p>
+        </w:tc>
+        <w:tc>
+          <w:tcPr>
+            <w:tcW w:type="dxa" w:w="4320"/>
+          </w:tcPr>
+          <w:p/>
+        </w:tc>
+      </w:tr>
+    </w:tbl>
+    <w:p/>
+    <w:p>
+      <w:pPr>
+        <w:pStyle w:val="Heading3"/>
+      </w:pPr>
+      <w:r>
+        <w:t>Afirmaciones a revisar</w:t>
+      </w:r>
+    </w:p>
+    <w:tbl>
+      <w:tblPr>
+        <w:tblStyle w:val="LightGrid-Accent1"/>
+        <w:tblW w:type="auto" w:w="0"/>
+        <w:tblLook w:firstColumn="1" w:firstRow="1" w:lastColumn="0" w:lastRow="0" w:noHBand="0" w:noVBand="1" w:val="04A0"/>
+      </w:tblPr>
+      <w:tblGrid>
+        <w:gridCol w:w="2160"/>
+        <w:gridCol w:w="2160"/>
+        <w:gridCol w:w="2160"/>
+        <w:gridCol w:w="2160"/>
+      </w:tblGrid>
+      <w:tr>
+        <w:tc>
+          <w:tcPr>
+            <w:tcW w:type="dxa" w:w="2160"/>
+          </w:tcPr>
+          <w:p>
+            <w:r>
+              <w:t>Motor</w:t>
+            </w:r>
+          </w:p>
+        </w:tc>
+        <w:tc>
+          <w:tcPr>
+            <w:tcW w:type="dxa" w:w="2160"/>
+          </w:tcPr>
+          <w:p>
+            <w:r>
+              <w:t>Lo que dice el motor</w:t>
+            </w:r>
+          </w:p>
+        </w:tc>
+        <w:tc>
+          <w:tcPr>
+            <w:tcW w:type="dxa" w:w="2160"/>
+          </w:tcPr>
+          <w:p>
+            <w:r>
+              <w:t>Estado</w:t>
+            </w:r>
+          </w:p>
+        </w:tc>
+        <w:tc>
+          <w:tcPr>
+            <w:tcW w:type="dxa" w:w="2160"/>
+          </w:tcPr>
+          <w:p>
+            <w:r>
+              <w:t>Motivo</w:t>
+            </w:r>
+          </w:p>
+        </w:tc>
+      </w:tr>
+      <w:tr>
+        <w:tc>
+          <w:tcPr>
+            <w:tcW w:type="dxa" w:w="2160"/>
+          </w:tcPr>
+          <w:p>
+            <w:r>
+              <w:t>{%tr for r in exactitud.revisar %}</w:t>
+            </w:r>
+          </w:p>
+        </w:tc>
+        <w:tc>
+          <w:tcPr>
+            <w:tcW w:type="dxa" w:w="2160"/>
+          </w:tcPr>
+          <w:p/>
+        </w:tc>
+        <w:tc>
+          <w:tcPr>
+            <w:tcW w:type="dxa" w:w="2160"/>
+          </w:tcPr>
+          <w:p/>
+        </w:tc>
+        <w:tc>
+          <w:tcPr>
+            <w:tcW w:type="dxa" w:w="2160"/>
+          </w:tcPr>
+          <w:p/>
+        </w:tc>
+      </w:tr>
+      <w:tr>
+        <w:tc>
+          <w:tcPr>
+            <w:tcW w:type="dxa" w:w="2160"/>
+          </w:tcPr>
+          <w:p>
+            <w:r>
+              <w:t>{{ r.motor }}</w:t>
+            </w:r>
+          </w:p>
+        </w:tc>
+        <w:tc>
+          <w:tcPr>
+            <w:tcW w:type="dxa" w:w="2160"/>
+          </w:tcPr>
+          <w:p>
+            <w:r>
+              <w:t>{{ r.texto }}</w:t>
+            </w:r>
+          </w:p>
+        </w:tc>
+        <w:tc>
+          <w:tcPr>
+            <w:tcW w:type="dxa" w:w="2160"/>
+          </w:tcPr>
+          <w:p>
+            <w:r>
+              <w:t>{{ r.estado }}</w:t>
+            </w:r>
+          </w:p>
+        </w:tc>
+        <w:tc>
+          <w:tcPr>
+            <w:tcW w:type="dxa" w:w="2160"/>
+          </w:tcPr>
+          <w:p>
+            <w:r>
+              <w:t>{{ r.motivo }}</w:t>
+            </w:r>
+          </w:p>
+        </w:tc>
+      </w:tr>
+      <w:tr>
+        <w:tc>
+          <w:tcPr>
+            <w:tcW w:type="dxa" w:w="2160"/>
+          </w:tcPr>
+          <w:p>
+            <w:r>
+              <w:t>{%tr endfor %}</w:t>
+            </w:r>
+          </w:p>
+        </w:tc>
+        <w:tc>
+          <w:tcPr>
+            <w:tcW w:type="dxa" w:w="2160"/>
+          </w:tcPr>
+          <w:p/>
+        </w:tc>
+        <w:tc>
+          <w:tcPr>
+            <w:tcW w:type="dxa" w:w="2160"/>
+          </w:tcPr>
+          <w:p/>
+        </w:tc>
+        <w:tc>
+          <w:tcPr>
+            <w:tcW w:type="dxa" w:w="2160"/>
+          </w:tcPr>
+          <w:p/>
+        </w:tc>
+      </w:tr>
+    </w:tbl>
+    <w:p/>
+    <w:p>
+      <w:r>
+        <w:t>{%p if exactitud.resto %}</w:t>
+      </w:r>
+    </w:p>
+    <w:p>
+      <w:r>
+        <w:t>{{ exactitud.resto }}</w:t>
+      </w:r>
+    </w:p>
+    <w:p>
+      <w:r>
+        <w:t>{%p endif %}</w:t>
+      </w:r>
+    </w:p>
+    <w:p>
+      <w:pPr>
+        <w:pStyle w:val="Heading3"/>
+      </w:pPr>
+      <w:r>
+        <w:t>Mitigaciones en origen</w:t>
+      </w:r>
+    </w:p>
+    <w:p>
+      <w:r>
+        <w:t>{%p if exactitud.mitigaciones %}</w:t>
+      </w:r>
+    </w:p>
+    <w:tbl>
+      <w:tblPr>
+        <w:tblStyle w:val="LightGrid-Accent1"/>
+        <w:tblW w:type="auto" w:w="0"/>
+        <w:tblLook w:firstColumn="1" w:firstRow="1" w:lastColumn="0" w:lastRow="0" w:noHBand="0" w:noVBand="1" w:val="04A0"/>
+      </w:tblPr>
+      <w:tblGrid>
+        <w:gridCol w:w="2160"/>
+        <w:gridCol w:w="2160"/>
+        <w:gridCol w:w="2160"/>
+        <w:gridCol w:w="2160"/>
+      </w:tblGrid>
+      <w:tr>
+        <w:tc>
+          <w:tcPr>
+            <w:tcW w:type="dxa" w:w="2160"/>
+          </w:tcPr>
+          <w:p>
+            <w:r>
+              <w:t>Id</w:t>
+            </w:r>
+          </w:p>
+        </w:tc>
+        <w:tc>
+          <w:tcPr>
+            <w:tcW w:type="dxa" w:w="2160"/>
+          </w:tcPr>
+          <w:p>
+            <w:r>
+              <w:t>Acción</w:t>
+            </w:r>
+          </w:p>
+        </w:tc>
+        <w:tc>
+          <w:tcPr>
+            <w:tcW w:type="dxa" w:w="2160"/>
+          </w:tcPr>
+          <w:p>
+            <w:r>
+              <w:t>Fuente que lo publica</w:t>
+            </w:r>
+          </w:p>
+        </w:tc>
+        <w:tc>
+          <w:tcPr>
+            <w:tcW w:type="dxa" w:w="2160"/>
+          </w:tcPr>
+          <w:p>
+            <w:r>
+              <w:t>Afirmaciones</w:t>
+            </w:r>
+          </w:p>
+        </w:tc>
+      </w:tr>
+      <w:tr>
+        <w:tc>
+          <w:tcPr>
+            <w:tcW w:type="dxa" w:w="2160"/>
+          </w:tcPr>
+          <w:p>
+            <w:r>
+              <w:t>{%tr for r in exactitud.mitigaciones %}</w:t>
+            </w:r>
+          </w:p>
+        </w:tc>
+        <w:tc>
+          <w:tcPr>
+            <w:tcW w:type="dxa" w:w="2160"/>
+          </w:tcPr>
+          <w:p/>
+        </w:tc>
+        <w:tc>
+          <w:tcPr>
+            <w:tcW w:type="dxa" w:w="2160"/>
+          </w:tcPr>
+          <w:p/>
+        </w:tc>
+        <w:tc>
+          <w:tcPr>
+            <w:tcW w:type="dxa" w:w="2160"/>
+          </w:tcPr>
+          <w:p/>
+        </w:tc>
+      </w:tr>
+      <w:tr>
+        <w:tc>
+          <w:tcPr>
+            <w:tcW w:type="dxa" w:w="2160"/>
+          </w:tcPr>
+          <w:p>
+            <w:r>
+              <w:t>{{ r.id }}</w:t>
+            </w:r>
+          </w:p>
+        </w:tc>
+        <w:tc>
+          <w:tcPr>
+            <w:tcW w:type="dxa" w:w="2160"/>
+          </w:tcPr>
+          <w:p>
+            <w:r>
+              <w:t>{{ r.descripcion }}</w:t>
+            </w:r>
+          </w:p>
+        </w:tc>
+        <w:tc>
+          <w:tcPr>
+            <w:tcW w:type="dxa" w:w="2160"/>
+          </w:tcPr>
+          <w:p>
+            <w:r>
+              <w:t>{{ r.fuente }}</w:t>
+            </w:r>
+          </w:p>
+        </w:tc>
+        <w:tc>
+          <w:tcPr>
+            <w:tcW w:type="dxa" w:w="2160"/>
+          </w:tcPr>
+          <w:p>
+            <w:r>
+              <w:t>{{ r.afirmaciones }}</w:t>
+            </w:r>
+          </w:p>
+        </w:tc>
+      </w:tr>
+      <w:tr>
+        <w:tc>
+          <w:tcPr>
+            <w:tcW w:type="dxa" w:w="2160"/>
+          </w:tcPr>
+          <w:p>
+            <w:r>
+              <w:t>{%tr endfor %}</w:t>
+            </w:r>
+          </w:p>
+        </w:tc>
+        <w:tc>
+          <w:tcPr>
+            <w:tcW w:type="dxa" w:w="2160"/>
+          </w:tcPr>
+          <w:p/>
+        </w:tc>
+        <w:tc>
+          <w:tcPr>
+            <w:tcW w:type="dxa" w:w="2160"/>
+          </w:tcPr>
+          <w:p/>
+        </w:tc>
+        <w:tc>
+          <w:tcPr>
+            <w:tcW w:type="dxa" w:w="2160"/>
+          </w:tcPr>
+          <w:p/>
+        </w:tc>
+      </w:tr>
+    </w:tbl>
+    <w:p/>
+    <w:p>
+      <w:r>
+        <w:t>{%p else %}</w:t>
+      </w:r>
+    </w:p>
+    <w:p>
+      <w:r>
+        <w:t>{{ exactitud.sin_mitigaciones }}</w:t>
+      </w:r>
+    </w:p>
+    <w:p>
+      <w:r>
+        <w:t>{%p endif %}</w:t>
+      </w:r>
+    </w:p>
+    <w:p>
+      <w:r>
+        <w:t>{%p else %}</w:t>
+      </w:r>
+    </w:p>
+    <w:p>
+      <w:r>
+        <w:t>{{ exactitud.aviso }}</w:t>
+      </w:r>
+    </w:p>
+    <w:p>
+      <w:r>
+        <w:t>{%p endif %}</w:t>
+      </w:r>
+    </w:p>
+    <w:p>
+      <w:r>
+        <w:t>{%p if auditoria.hay %}</w:t>
+      </w:r>
+    </w:p>
+    <w:p>
+      <w:pPr>
+        <w:pStyle w:val="Heading2"/>
+      </w:pPr>
+      <w:r>
+        <w:t>Auditoría técnica de la web: {{ auditoria.dominio }}</w:t>
+      </w:r>
+    </w:p>
+    <w:p>
+      <w:r>
+        <w:t>{{ auditoria.intro }}</w:t>
+      </w:r>
+    </w:p>
+    <w:p>
+      <w:r>
+        <w:t>{%p if auditoria.aviso %}</w:t>
+      </w:r>
+    </w:p>
+    <w:p>
+      <w:pPr>
+        <w:pStyle w:val="IntenseQuote"/>
+      </w:pPr>
+      <w:r>
+        <w:t>{{ auditoria.aviso }}</w:t>
+      </w:r>
+    </w:p>
+    <w:p>
+      <w:r>
+        <w:t>{%p endif %}</w:t>
+      </w:r>
+    </w:p>
+    <w:tbl>
+      <w:tblPr>
+        <w:tblStyle w:val="LightList-Accent1"/>
+        <w:tblW w:type="auto" w:w="0"/>
+        <w:tblLook w:firstColumn="1" w:firstRow="1" w:lastColumn="0" w:lastRow="0" w:noHBand="0" w:noVBand="1" w:val="04A0"/>
+      </w:tblPr>
+      <w:tblGrid>
+        <w:gridCol w:w="4320"/>
+        <w:gridCol w:w="4320"/>
+      </w:tblGrid>
+      <w:tr>
+        <w:tc>
+          <w:tcPr>
+            <w:tcW w:type="dxa" w:w="4320"/>
+          </w:tcPr>
+          <w:p>
+            <w:r>
+              <w:t>Preparación para los motores</w:t>
+            </w:r>
+          </w:p>
+        </w:tc>
+        <w:tc>
+          <w:tcPr>
+            <w:tcW w:type="dxa" w:w="4320"/>
+          </w:tcPr>
+          <w:p>
+            <w:r>
+              <w:t>{{ auditoria.puntuacion }}</w:t>
+            </w:r>
+          </w:p>
+        </w:tc>
+      </w:tr>
+      <w:tr>
+        <w:tc>
+          <w:tcPr>
+            <w:tcW w:type="dxa" w:w="4320"/>
+          </w:tcPr>
+          <w:p>
+            <w:r>
+              <w:t>Fecha de la auditoría</w:t>
+            </w:r>
+          </w:p>
+        </w:tc>
+        <w:tc>
+          <w:tcPr>
+            <w:tcW w:type="dxa" w:w="4320"/>
+          </w:tcPr>
+          <w:p>
+            <w:r>
+              <w:t>{{ auditoria.fecha }}</w:t>
+            </w:r>
+          </w:p>
+        </w:tc>
+      </w:tr>
+    </w:tbl>
+    <w:p/>
+    <w:tbl>
+      <w:tblPr>
+        <w:tblStyle w:val="LightGrid-Accent1"/>
+        <w:tblW w:type="auto" w:w="0"/>
+        <w:tblLook w:firstColumn="1" w:firstRow="1" w:lastColumn="0" w:lastRow="0" w:noHBand="0" w:noVBand="1" w:val="04A0"/>
+      </w:tblPr>
+      <w:tblGrid>
+        <w:gridCol w:w="2160"/>
+        <w:gridCol w:w="2160"/>
+        <w:gridCol w:w="2160"/>
+        <w:gridCol w:w="2160"/>
+      </w:tblGrid>
+      <w:tr>
+        <w:tc>
+          <w:tcPr>
+            <w:tcW w:type="dxa" w:w="2160"/>
+          </w:tcPr>
+          <w:p>
+            <w:r>
+              <w:t>Bloque</w:t>
+            </w:r>
+          </w:p>
+        </w:tc>
+        <w:tc>
+          <w:tcPr>
+            <w:tcW w:type="dxa" w:w="2160"/>
+          </w:tcPr>
+          <w:p>
+            <w:r>
+              <w:t>Puntuación</w:t>
+            </w:r>
+          </w:p>
+        </w:tc>
+        <w:tc>
+          <w:tcPr>
+            <w:tcW w:type="dxa" w:w="2160"/>
+          </w:tcPr>
+          <w:p>
+            <w:r>
+              <w:t>Correctas</w:t>
+            </w:r>
+          </w:p>
+        </w:tc>
+        <w:tc>
+          <w:tcPr>
+            <w:tcW w:type="dxa" w:w="2160"/>
+          </w:tcPr>
+          <w:p>
+            <w:r>
+              <w:t>Fallan</w:t>
+            </w:r>
+          </w:p>
+        </w:tc>
+      </w:tr>
+      <w:tr>
+        <w:tc>
+          <w:tcPr>
+            <w:tcW w:type="dxa" w:w="2160"/>
+          </w:tcPr>
+          <w:p>
+            <w:r>
+              <w:t>{%tr for r in auditoria.bloques %}</w:t>
+            </w:r>
+          </w:p>
+        </w:tc>
+        <w:tc>
+          <w:tcPr>
+            <w:tcW w:type="dxa" w:w="2160"/>
+          </w:tcPr>
+          <w:p/>
+        </w:tc>
+        <w:tc>
+          <w:tcPr>
+            <w:tcW w:type="dxa" w:w="2160"/>
+          </w:tcPr>
+          <w:p/>
+        </w:tc>
+        <w:tc>
+          <w:tcPr>
+            <w:tcW w:type="dxa" w:w="2160"/>
+          </w:tcPr>
+          <w:p/>
+        </w:tc>
+      </w:tr>
+      <w:tr>
+        <w:tc>
+          <w:tcPr>
+            <w:tcW w:type="dxa" w:w="2160"/>
+          </w:tcPr>
+          <w:p>
+            <w:r>
+              <w:t>{{ r.bloque }}</w:t>
+            </w:r>
+          </w:p>
+        </w:tc>
+        <w:tc>
+          <w:tcPr>
+            <w:tcW w:type="dxa" w:w="2160"/>
+          </w:tcPr>
+          <w:p>
+            <w:r>
+              <w:t>{{ r.puntuacion }}</w:t>
+            </w:r>
+          </w:p>
+        </w:tc>
+        <w:tc>
+          <w:tcPr>
+            <w:tcW w:type="dxa" w:w="2160"/>
+          </w:tcPr>
+          <w:p>
+            <w:r>
+              <w:t>{{ r.ok }}</w:t>
+            </w:r>
+          </w:p>
+        </w:tc>
+        <w:tc>
+          <w:tcPr>
+            <w:tcW w:type="dxa" w:w="2160"/>
+          </w:tcPr>
+          <w:p>
+            <w:r>
+              <w:t>{{ r.falla }}</w:t>
+            </w:r>
+          </w:p>
+        </w:tc>
+      </w:tr>
+      <w:tr>
+        <w:tc>
+          <w:tcPr>
+            <w:tcW w:type="dxa" w:w="2160"/>
+          </w:tcPr>
+          <w:p>
+            <w:r>
+              <w:t>{%tr endfor %}</w:t>
+            </w:r>
+          </w:p>
+        </w:tc>
+        <w:tc>
+          <w:tcPr>
+            <w:tcW w:type="dxa" w:w="2160"/>
+          </w:tcPr>
+          <w:p/>
+        </w:tc>
+        <w:tc>
+          <w:tcPr>
+            <w:tcW w:type="dxa" w:w="2160"/>
+          </w:tcPr>
+          <w:p/>
+        </w:tc>
+        <w:tc>
+          <w:tcPr>
+            <w:tcW w:type="dxa" w:w="2160"/>
+          </w:tcPr>
+          <w:p/>
+        </w:tc>
+      </w:tr>
+    </w:tbl>
+    <w:p/>
+    <w:p>
+      <w:pPr>
+        <w:pStyle w:val="Heading3"/>
+      </w:pPr>
+      <w:r>
+        <w:t>Comprobaciones que fallan</w:t>
+      </w:r>
+    </w:p>
+    <w:tbl>
+      <w:tblPr>
+        <w:tblStyle w:val="LightGrid-Accent1"/>
+        <w:tblW w:type="auto" w:w="0"/>
+        <w:tblLook w:firstColumn="1" w:firstRow="1" w:lastColumn="0" w:lastRow="0" w:noHBand="0" w:noVBand="1" w:val="04A0"/>
+      </w:tblPr>
+      <w:tblGrid>
+        <w:gridCol w:w="2160"/>
+        <w:gridCol w:w="2160"/>
+        <w:gridCol w:w="2160"/>
+        <w:gridCol w:w="2160"/>
+      </w:tblGrid>
+      <w:tr>
+        <w:tc>
+          <w:tcPr>
+            <w:tcW w:type="dxa" w:w="2160"/>
+          </w:tcPr>
+          <w:p>
+            <w:r>
+              <w:t>Comprobación</w:t>
+            </w:r>
+          </w:p>
+        </w:tc>
+        <w:tc>
+          <w:tcPr>
+            <w:tcW w:type="dxa" w:w="2160"/>
+          </w:tcPr>
+          <w:p>
+            <w:r>
+              <w:t>Detalle</w:t>
+            </w:r>
+          </w:p>
+        </w:tc>
+        <w:tc>
+          <w:tcPr>
+            <w:tcW w:type="dxa" w:w="2160"/>
+          </w:tcPr>
+          <w:p>
+            <w:r>
+              <w:t>Motores afectados</w:t>
+            </w:r>
+          </w:p>
+        </w:tc>
+        <w:tc>
+          <w:tcPr>
+            <w:tcW w:type="dxa" w:w="2160"/>
+          </w:tcPr>
+          <w:p>
+            <w:r>
+              <w:t>Evidencia</w:t>
+            </w:r>
+          </w:p>
+        </w:tc>
+      </w:tr>
+      <w:tr>
+        <w:tc>
+          <w:tcPr>
+            <w:tcW w:type="dxa" w:w="2160"/>
+          </w:tcPr>
+          <w:p>
+            <w:r>
+              <w:t>{%tr for r in auditoria.fallos %}</w:t>
+            </w:r>
+          </w:p>
+        </w:tc>
+        <w:tc>
+          <w:tcPr>
+            <w:tcW w:type="dxa" w:w="2160"/>
+          </w:tcPr>
+          <w:p/>
+        </w:tc>
+        <w:tc>
+          <w:tcPr>
+            <w:tcW w:type="dxa" w:w="2160"/>
+          </w:tcPr>
+          <w:p/>
+        </w:tc>
+        <w:tc>
+          <w:tcPr>
+            <w:tcW w:type="dxa" w:w="2160"/>
+          </w:tcPr>
+          <w:p/>
+        </w:tc>
+      </w:tr>
+      <w:tr>
+        <w:tc>
+          <w:tcPr>
+            <w:tcW w:type="dxa" w:w="2160"/>
+          </w:tcPr>
+          <w:p>
+            <w:r>
+              <w:t>{{ r.titulo }}</w:t>
+            </w:r>
+          </w:p>
+        </w:tc>
+        <w:tc>
+          <w:tcPr>
+            <w:tcW w:type="dxa" w:w="2160"/>
+          </w:tcPr>
+          <w:p>
+            <w:r>
+              <w:t>{{ r.detalle }}</w:t>
+            </w:r>
+          </w:p>
+        </w:tc>
+        <w:tc>
+          <w:tcPr>
+            <w:tcW w:type="dxa" w:w="2160"/>
+          </w:tcPr>
+          <w:p>
+            <w:r>
+              <w:t>{{ r.motores }}</w:t>
+            </w:r>
+          </w:p>
+        </w:tc>
+        <w:tc>
+          <w:tcPr>
+            <w:tcW w:type="dxa" w:w="2160"/>
+          </w:tcPr>
+          <w:p>
+            <w:r>
+              <w:t>{{ r.evidencia }}</w:t>
+            </w:r>
+          </w:p>
+        </w:tc>
+      </w:tr>
+      <w:tr>
+        <w:tc>
+          <w:tcPr>
+            <w:tcW w:type="dxa" w:w="2160"/>
+          </w:tcPr>
+          <w:p>
+            <w:r>
+              <w:t>{%tr endfor %}</w:t>
+            </w:r>
+          </w:p>
+        </w:tc>
+        <w:tc>
+          <w:tcPr>
+            <w:tcW w:type="dxa" w:w="2160"/>
+          </w:tcPr>
+          <w:p/>
+        </w:tc>
+        <w:tc>
+          <w:tcPr>
+            <w:tcW w:type="dxa" w:w="2160"/>
+          </w:tcPr>
+          <w:p/>
+        </w:tc>
+        <w:tc>
+          <w:tcPr>
+            <w:tcW w:type="dxa" w:w="2160"/>
+          </w:tcPr>
+          <w:p/>
+        </w:tc>
+      </w:tr>
+    </w:tbl>
+    <w:p/>
+    <w:p>
+      <w:pPr>
+        <w:pStyle w:val="Heading3"/>
+      </w:pPr>
+      <w:r>
+        <w:t>Acceso de los bots de IA</w:t>
+      </w:r>
+    </w:p>
+    <w:tbl>
+      <w:tblPr>
+        <w:tblStyle w:val="LightGrid-Accent1"/>
+        <w:tblW w:type="auto" w:w="0"/>
+        <w:tblLook w:firstColumn="1" w:firstRow="1" w:lastColumn="0" w:lastRow="0" w:noHBand="0" w:noVBand="1" w:val="04A0"/>
+      </w:tblPr>
+      <w:tblGrid>
+        <w:gridCol w:w="2880"/>
+        <w:gridCol w:w="2880"/>
+        <w:gridCol w:w="2880"/>
+      </w:tblGrid>
+      <w:tr>
+        <w:tc>
+          <w:tcPr>
+            <w:tcW w:type="dxa" w:w="2880"/>
+          </w:tcPr>
+          <w:p>
+            <w:r>
+              <w:t>Bot</w:t>
+            </w:r>
+          </w:p>
+        </w:tc>
+        <w:tc>
+          <w:tcPr>
+            <w:tcW w:type="dxa" w:w="2880"/>
+          </w:tcPr>
+          <w:p>
+            <w:r>
+              <w:t>Motor</w:t>
+            </w:r>
+          </w:p>
+        </w:tc>
+        <w:tc>
+          <w:tcPr>
+            <w:tcW w:type="dxa" w:w="2880"/>
+          </w:tcPr>
+          <w:p>
+            <w:r>
+              <w:t>Permitido</w:t>
+            </w:r>
+          </w:p>
+        </w:tc>
+      </w:tr>
+      <w:tr>
+        <w:tc>
+          <w:tcPr>
+            <w:tcW w:type="dxa" w:w="2880"/>
+          </w:tcPr>
+          <w:p>
+            <w:r>
+              <w:t>{%tr for r in auditoria.bots %}</w:t>
+            </w:r>
+          </w:p>
+        </w:tc>
+        <w:tc>
+          <w:tcPr>
+            <w:tcW w:type="dxa" w:w="2880"/>
+          </w:tcPr>
+          <w:p/>
+        </w:tc>
+        <w:tc>
+          <w:tcPr>
+            <w:tcW w:type="dxa" w:w="2880"/>
+          </w:tcPr>
+          <w:p/>
+        </w:tc>
+      </w:tr>
+      <w:tr>
+        <w:tc>
+          <w:tcPr>
+            <w:tcW w:type="dxa" w:w="2880"/>
+          </w:tcPr>
+          <w:p>
+            <w:r>
+              <w:t>{{ r.bot }}</w:t>
+            </w:r>
+          </w:p>
+        </w:tc>
+        <w:tc>
+          <w:tcPr>
+            <w:tcW w:type="dxa" w:w="2880"/>
+          </w:tcPr>
+          <w:p>
+            <w:r>
+              <w:t>{{ r.motor }}</w:t>
+            </w:r>
+          </w:p>
+        </w:tc>
+        <w:tc>
+          <w:tcPr>
+            <w:tcW w:type="dxa" w:w="2880"/>
+          </w:tcPr>
+          <w:p>
+            <w:r>
+              <w:t>{{ r.permitido }}</w:t>
+            </w:r>
+          </w:p>
+        </w:tc>
+      </w:tr>
+      <w:tr>
+        <w:tc>
+          <w:tcPr>
+            <w:tcW w:type="dxa" w:w="2880"/>
+          </w:tcPr>
+          <w:p>
+            <w:r>
+              <w:t>{%tr endfor %}</w:t>
+            </w:r>
+          </w:p>
+        </w:tc>
+        <w:tc>
+          <w:tcPr>
+            <w:tcW w:type="dxa" w:w="2880"/>
+          </w:tcPr>
+          <w:p/>
+        </w:tc>
+        <w:tc>
+          <w:tcPr>
+            <w:tcW w:type="dxa" w:w="2880"/>
+          </w:tcPr>
+          <w:p/>
+        </w:tc>
+      </w:tr>
+    </w:tbl>
+    <w:p/>
+    <w:p>
+      <w:r>
+        <w:t>{%p endif %}</w:t>
+      </w:r>
+    </w:p>
+    <w:p>
+      <w:pPr>
+        <w:pStyle w:val="Heading1"/>
+      </w:pPr>
+      <w:r>
+        <w:t>8. Estrategia recomendada</w:t>
       </w:r>
     </w:p>
     <w:p>
@@ -3044,7 +5270,7 @@
         <w:pStyle w:val="Heading1"/>
       </w:pPr>
       <w:r>
-        <w:t>8. Plan de acción por fases</w:t>
+        <w:t>9. Plan de acción por fases</w:t>
       </w:r>
     </w:p>
     <w:tbl>
@@ -3403,7 +5629,22 @@
         <w:pStyle w:val="Heading1"/>
       </w:pPr>
       <w:r>
-        <w:t>9. Medición y seguimiento</w:t>
+        <w:t>10. Escenarios y simulación del plan</w:t>
+      </w:r>
+    </w:p>
+    <w:p>
+      <w:r>
+        <w:t>{%p if escenarios.hay %}</w:t>
+      </w:r>
+    </w:p>
+    <w:p>
+      <w:r>
+        <w:t>{{ escenarios.intro }}</w:t>
+      </w:r>
+    </w:p>
+    <w:p>
+      <w:r>
+        <w:t>{%p if escenarios.hay_escenarios %}</w:t>
       </w:r>
     </w:p>
     <w:p>
@@ -3411,7 +5652,725 @@
         <w:pStyle w:val="Heading2"/>
       </w:pPr>
       <w:r>
-        <w:t>KPIs</w:t>
+        <w:t>Escenarios del plan</w:t>
+      </w:r>
+    </w:p>
+    <w:tbl>
+      <w:tblPr>
+        <w:tblStyle w:val="LightGrid-Accent1"/>
+        <w:tblW w:type="auto" w:w="0"/>
+        <w:tblLook w:firstColumn="1" w:firstRow="1" w:lastColumn="0" w:lastRow="0" w:noHBand="0" w:noVBand="1" w:val="04A0"/>
+      </w:tblPr>
+      <w:tblGrid>
+        <w:gridCol w:w="1440"/>
+        <w:gridCol w:w="1440"/>
+        <w:gridCol w:w="1440"/>
+        <w:gridCol w:w="1440"/>
+        <w:gridCol w:w="1440"/>
+        <w:gridCol w:w="1440"/>
+      </w:tblGrid>
+      <w:tr>
+        <w:tc>
+          <w:tcPr>
+            <w:tcW w:type="dxa" w:w="1440"/>
+          </w:tcPr>
+          <w:p>
+            <w:r>
+              <w:t>Escenario</w:t>
+            </w:r>
+          </w:p>
+        </w:tc>
+        <w:tc>
+          <w:tcPr>
+            <w:tcW w:type="dxa" w:w="1440"/>
+          </w:tcPr>
+          <w:p>
+            <w:r>
+              <w:t>Acciones</w:t>
+            </w:r>
+          </w:p>
+        </w:tc>
+        <w:tc>
+          <w:tcPr>
+            <w:tcW w:type="dxa" w:w="1440"/>
+          </w:tcPr>
+          <w:p>
+            <w:r>
+              <w:t>Aplazadas</w:t>
+            </w:r>
+          </w:p>
+        </w:tc>
+        <w:tc>
+          <w:tcPr>
+            <w:tcW w:type="dxa" w:w="1440"/>
+          </w:tcPr>
+          <w:p>
+            <w:r>
+              <w:t>Hallazgos sin cubrir</w:t>
+            </w:r>
+          </w:p>
+        </w:tc>
+        <w:tc>
+          <w:tcPr>
+            <w:tcW w:type="dxa" w:w="1440"/>
+          </w:tcPr>
+          <w:p>
+            <w:r>
+              <w:t>Esfuerzo</w:t>
+            </w:r>
+          </w:p>
+        </w:tc>
+        <w:tc>
+          <w:tcPr>
+            <w:tcW w:type="dxa" w:w="1440"/>
+          </w:tcPr>
+          <w:p>
+            <w:r>
+              <w:t>Score proyectado [mín.–máx.]</w:t>
+            </w:r>
+          </w:p>
+        </w:tc>
+      </w:tr>
+      <w:tr>
+        <w:tc>
+          <w:tcPr>
+            <w:tcW w:type="dxa" w:w="1440"/>
+          </w:tcPr>
+          <w:p>
+            <w:r>
+              <w:t>{%tr for r in escenarios.escenarios %}</w:t>
+            </w:r>
+          </w:p>
+        </w:tc>
+        <w:tc>
+          <w:tcPr>
+            <w:tcW w:type="dxa" w:w="1440"/>
+          </w:tcPr>
+          <w:p/>
+        </w:tc>
+        <w:tc>
+          <w:tcPr>
+            <w:tcW w:type="dxa" w:w="1440"/>
+          </w:tcPr>
+          <w:p/>
+        </w:tc>
+        <w:tc>
+          <w:tcPr>
+            <w:tcW w:type="dxa" w:w="1440"/>
+          </w:tcPr>
+          <w:p/>
+        </w:tc>
+        <w:tc>
+          <w:tcPr>
+            <w:tcW w:type="dxa" w:w="1440"/>
+          </w:tcPr>
+          <w:p/>
+        </w:tc>
+        <w:tc>
+          <w:tcPr>
+            <w:tcW w:type="dxa" w:w="1440"/>
+          </w:tcPr>
+          <w:p/>
+        </w:tc>
+      </w:tr>
+      <w:tr>
+        <w:tc>
+          <w:tcPr>
+            <w:tcW w:type="dxa" w:w="1440"/>
+          </w:tcPr>
+          <w:p>
+            <w:r>
+              <w:t>{{ r.nombre }}</w:t>
+            </w:r>
+          </w:p>
+        </w:tc>
+        <w:tc>
+          <w:tcPr>
+            <w:tcW w:type="dxa" w:w="1440"/>
+          </w:tcPr>
+          <w:p>
+            <w:r>
+              <w:t>{{ r.mantenidas }}</w:t>
+            </w:r>
+          </w:p>
+        </w:tc>
+        <w:tc>
+          <w:tcPr>
+            <w:tcW w:type="dxa" w:w="1440"/>
+          </w:tcPr>
+          <w:p>
+            <w:r>
+              <w:t>{{ r.aplazadas }}</w:t>
+            </w:r>
+          </w:p>
+        </w:tc>
+        <w:tc>
+          <w:tcPr>
+            <w:tcW w:type="dxa" w:w="1440"/>
+          </w:tcPr>
+          <w:p>
+            <w:r>
+              <w:t>{{ r.sin_cubrir }}</w:t>
+            </w:r>
+          </w:p>
+        </w:tc>
+        <w:tc>
+          <w:tcPr>
+            <w:tcW w:type="dxa" w:w="1440"/>
+          </w:tcPr>
+          <w:p>
+            <w:r>
+              <w:t>{{ r.esfuerzo }}</w:t>
+            </w:r>
+          </w:p>
+        </w:tc>
+        <w:tc>
+          <w:tcPr>
+            <w:tcW w:type="dxa" w:w="1440"/>
+          </w:tcPr>
+          <w:p>
+            <w:r>
+              <w:t>{{ r.score }}</w:t>
+            </w:r>
+          </w:p>
+        </w:tc>
+      </w:tr>
+      <w:tr>
+        <w:tc>
+          <w:tcPr>
+            <w:tcW w:type="dxa" w:w="1440"/>
+          </w:tcPr>
+          <w:p>
+            <w:r>
+              <w:t>{%tr endfor %}</w:t>
+            </w:r>
+          </w:p>
+        </w:tc>
+        <w:tc>
+          <w:tcPr>
+            <w:tcW w:type="dxa" w:w="1440"/>
+          </w:tcPr>
+          <w:p/>
+        </w:tc>
+        <w:tc>
+          <w:tcPr>
+            <w:tcW w:type="dxa" w:w="1440"/>
+          </w:tcPr>
+          <w:p/>
+        </w:tc>
+        <w:tc>
+          <w:tcPr>
+            <w:tcW w:type="dxa" w:w="1440"/>
+          </w:tcPr>
+          <w:p/>
+        </w:tc>
+        <w:tc>
+          <w:tcPr>
+            <w:tcW w:type="dxa" w:w="1440"/>
+          </w:tcPr>
+          <w:p/>
+        </w:tc>
+        <w:tc>
+          <w:tcPr>
+            <w:tcW w:type="dxa" w:w="1440"/>
+          </w:tcPr>
+          <w:p/>
+        </w:tc>
+      </w:tr>
+    </w:tbl>
+    <w:p/>
+    <w:p>
+      <w:r>
+        <w:t>{%p endif %}</w:t>
+      </w:r>
+    </w:p>
+    <w:p>
+      <w:r>
+        <w:t>{%p if escenarios.hay_simulacion %}</w:t>
+      </w:r>
+    </w:p>
+    <w:p>
+      <w:pPr>
+        <w:pStyle w:val="Heading2"/>
+      </w:pPr>
+      <w:r>
+        <w:t>Simulación del plan completo por fases</w:t>
+      </w:r>
+    </w:p>
+    <w:p>
+      <w:r>
+        <w:t>Score de Citación actual: {{ escenarios.actual }}.</w:t>
+      </w:r>
+    </w:p>
+    <w:tbl>
+      <w:tblPr>
+        <w:tblStyle w:val="LightGrid-Accent1"/>
+        <w:tblW w:type="auto" w:w="0"/>
+        <w:tblLook w:firstColumn="1" w:firstRow="1" w:lastColumn="0" w:lastRow="0" w:noHBand="0" w:noVBand="1" w:val="04A0"/>
+      </w:tblPr>
+      <w:tblGrid>
+        <w:gridCol w:w="2880"/>
+        <w:gridCol w:w="2880"/>
+        <w:gridCol w:w="2880"/>
+      </w:tblGrid>
+      <w:tr>
+        <w:tc>
+          <w:tcPr>
+            <w:tcW w:type="dxa" w:w="2880"/>
+          </w:tcPr>
+          <w:p>
+            <w:r>
+              <w:t>Al terminar</w:t>
+            </w:r>
+          </w:p>
+        </w:tc>
+        <w:tc>
+          <w:tcPr>
+            <w:tcW w:type="dxa" w:w="2880"/>
+          </w:tcPr>
+          <w:p>
+            <w:r>
+              <w:t>Score proyectado [mín.–máx.]</w:t>
+            </w:r>
+          </w:p>
+        </w:tc>
+        <w:tc>
+          <w:tcPr>
+            <w:tcW w:type="dxa" w:w="2880"/>
+          </w:tcPr>
+          <w:p>
+            <w:r>
+              <w:t>Visibilidad espontánea [mín.–máx.]</w:t>
+            </w:r>
+          </w:p>
+        </w:tc>
+      </w:tr>
+      <w:tr>
+        <w:tc>
+          <w:tcPr>
+            <w:tcW w:type="dxa" w:w="2880"/>
+          </w:tcPr>
+          <w:p>
+            <w:r>
+              <w:t>{%tr for r in escenarios.fases %}</w:t>
+            </w:r>
+          </w:p>
+        </w:tc>
+        <w:tc>
+          <w:tcPr>
+            <w:tcW w:type="dxa" w:w="2880"/>
+          </w:tcPr>
+          <w:p/>
+        </w:tc>
+        <w:tc>
+          <w:tcPr>
+            <w:tcW w:type="dxa" w:w="2880"/>
+          </w:tcPr>
+          <w:p/>
+        </w:tc>
+      </w:tr>
+      <w:tr>
+        <w:tc>
+          <w:tcPr>
+            <w:tcW w:type="dxa" w:w="2880"/>
+          </w:tcPr>
+          <w:p>
+            <w:r>
+              <w:t>{{ r.fase }}</w:t>
+            </w:r>
+          </w:p>
+        </w:tc>
+        <w:tc>
+          <w:tcPr>
+            <w:tcW w:type="dxa" w:w="2880"/>
+          </w:tcPr>
+          <w:p>
+            <w:r>
+              <w:t>{{ r.score }}</w:t>
+            </w:r>
+          </w:p>
+        </w:tc>
+        <w:tc>
+          <w:tcPr>
+            <w:tcW w:type="dxa" w:w="2880"/>
+          </w:tcPr>
+          <w:p>
+            <w:r>
+              <w:t>{{ r.tasa }}</w:t>
+            </w:r>
+          </w:p>
+        </w:tc>
+      </w:tr>
+      <w:tr>
+        <w:tc>
+          <w:tcPr>
+            <w:tcW w:type="dxa" w:w="2880"/>
+          </w:tcPr>
+          <w:p>
+            <w:r>
+              <w:t>{%tr endfor %}</w:t>
+            </w:r>
+          </w:p>
+        </w:tc>
+        <w:tc>
+          <w:tcPr>
+            <w:tcW w:type="dxa" w:w="2880"/>
+          </w:tcPr>
+          <w:p/>
+        </w:tc>
+        <w:tc>
+          <w:tcPr>
+            <w:tcW w:type="dxa" w:w="2880"/>
+          </w:tcPr>
+          <w:p/>
+        </w:tc>
+      </w:tr>
+    </w:tbl>
+    <w:p/>
+    <w:p>
+      <w:pPr>
+        <w:pStyle w:val="Heading3"/>
+      </w:pPr>
+      <w:r>
+        <w:t>Supuestos</w:t>
+      </w:r>
+    </w:p>
+    <w:p>
+      <w:r>
+        <w:t>{%p for item in escenarios.supuestos %}</w:t>
+      </w:r>
+    </w:p>
+    <w:p>
+      <w:pPr>
+        <w:pStyle w:val="ListBullet"/>
+      </w:pPr>
+      <w:r>
+        <w:t>{{ item }}</w:t>
+      </w:r>
+    </w:p>
+    <w:p>
+      <w:r>
+        <w:t>{%p endfor %}</w:t>
+      </w:r>
+    </w:p>
+    <w:p>
+      <w:pPr>
+        <w:pStyle w:val="IntenseQuote"/>
+      </w:pPr>
+      <w:r>
+        <w:t>{{ escenarios.advertencia }}</w:t>
+      </w:r>
+    </w:p>
+    <w:p>
+      <w:r>
+        <w:t>Modelo de simulación: {{ escenarios.modelo }}.</w:t>
+      </w:r>
+    </w:p>
+    <w:p>
+      <w:r>
+        <w:t>{%p endif %}</w:t>
+      </w:r>
+    </w:p>
+    <w:p>
+      <w:r>
+        <w:t>{%p else %}</w:t>
+      </w:r>
+    </w:p>
+    <w:p>
+      <w:r>
+        <w:t>{{ escenarios.aviso }}</w:t>
+      </w:r>
+    </w:p>
+    <w:p>
+      <w:r>
+        <w:t>{%p endif %}</w:t>
+      </w:r>
+    </w:p>
+    <w:p>
+      <w:pPr>
+        <w:pStyle w:val="Heading1"/>
+      </w:pPr>
+      <w:r>
+        <w:t>11. Seguimiento con método</w:t>
+      </w:r>
+    </w:p>
+    <w:p>
+      <w:r>
+        <w:t>{{ seguimiento.intro }}</w:t>
+      </w:r>
+    </w:p>
+    <w:p>
+      <w:r>
+        <w:t>{%p for m in seguimiento.metodo %}</w:t>
+      </w:r>
+    </w:p>
+    <w:p>
+      <w:pPr>
+        <w:pStyle w:val="Heading3"/>
+      </w:pPr>
+      <w:r>
+        <w:t>{{ m.titulo }}</w:t>
+      </w:r>
+    </w:p>
+    <w:p>
+      <w:r>
+        <w:t>{{ m.texto }}</w:t>
+      </w:r>
+    </w:p>
+    <w:p>
+      <w:r>
+        <w:t>{%p endfor %}</w:t>
+      </w:r>
+    </w:p>
+    <w:p>
+      <w:pPr>
+        <w:pStyle w:val="Heading2"/>
+      </w:pPr>
+      <w:r>
+        <w:t>Línea base de este estudio</w:t>
+      </w:r>
+    </w:p>
+    <w:tbl>
+      <w:tblPr>
+        <w:tblStyle w:val="LightGrid-Accent1"/>
+        <w:tblW w:type="auto" w:w="0"/>
+        <w:tblLook w:firstColumn="1" w:firstRow="1" w:lastColumn="0" w:lastRow="0" w:noHBand="0" w:noVBand="1" w:val="04A0"/>
+      </w:tblPr>
+      <w:tblGrid>
+        <w:gridCol w:w="4320"/>
+        <w:gridCol w:w="4320"/>
+      </w:tblGrid>
+      <w:tr>
+        <w:tc>
+          <w:tcPr>
+            <w:tcW w:type="dxa" w:w="4320"/>
+          </w:tcPr>
+          <w:p>
+            <w:r>
+              <w:t>Indicador</w:t>
+            </w:r>
+          </w:p>
+        </w:tc>
+        <w:tc>
+          <w:tcPr>
+            <w:tcW w:type="dxa" w:w="4320"/>
+          </w:tcPr>
+          <w:p>
+            <w:r>
+              <w:t>Valor</w:t>
+            </w:r>
+          </w:p>
+        </w:tc>
+      </w:tr>
+      <w:tr>
+        <w:tc>
+          <w:tcPr>
+            <w:tcW w:type="dxa" w:w="4320"/>
+          </w:tcPr>
+          <w:p>
+            <w:r>
+              <w:t>{%tr for r in seguimiento.linea_base %}</w:t>
+            </w:r>
+          </w:p>
+        </w:tc>
+        <w:tc>
+          <w:tcPr>
+            <w:tcW w:type="dxa" w:w="4320"/>
+          </w:tcPr>
+          <w:p/>
+        </w:tc>
+      </w:tr>
+      <w:tr>
+        <w:tc>
+          <w:tcPr>
+            <w:tcW w:type="dxa" w:w="4320"/>
+          </w:tcPr>
+          <w:p>
+            <w:r>
+              <w:t>{{ r.campo }}</w:t>
+            </w:r>
+          </w:p>
+        </w:tc>
+        <w:tc>
+          <w:tcPr>
+            <w:tcW w:type="dxa" w:w="4320"/>
+          </w:tcPr>
+          <w:p>
+            <w:r>
+              <w:t>{{ r.valor }}</w:t>
+            </w:r>
+          </w:p>
+        </w:tc>
+      </w:tr>
+      <w:tr>
+        <w:tc>
+          <w:tcPr>
+            <w:tcW w:type="dxa" w:w="4320"/>
+          </w:tcPr>
+          <w:p>
+            <w:r>
+              <w:t>{%tr endfor %}</w:t>
+            </w:r>
+          </w:p>
+        </w:tc>
+        <w:tc>
+          <w:tcPr>
+            <w:tcW w:type="dxa" w:w="4320"/>
+          </w:tcPr>
+          <w:p/>
+        </w:tc>
+      </w:tr>
+    </w:tbl>
+    <w:p/>
+    <w:p>
+      <w:r>
+        <w:t>{%p if seguimiento.hay_remedicion %}</w:t>
+      </w:r>
+    </w:p>
+    <w:p>
+      <w:pPr>
+        <w:pStyle w:val="Heading2"/>
+      </w:pPr>
+      <w:r>
+        <w:t>Cambios fuera del margen frente a la medición anterior</w:t>
+      </w:r>
+    </w:p>
+    <w:tbl>
+      <w:tblPr>
+        <w:tblStyle w:val="LightGrid-Accent1"/>
+        <w:tblW w:type="auto" w:w="0"/>
+        <w:tblLook w:firstColumn="1" w:firstRow="1" w:lastColumn="0" w:lastRow="0" w:noHBand="0" w:noVBand="1" w:val="04A0"/>
+      </w:tblPr>
+      <w:tblGrid>
+        <w:gridCol w:w="2880"/>
+        <w:gridCol w:w="2880"/>
+        <w:gridCol w:w="2880"/>
+      </w:tblGrid>
+      <w:tr>
+        <w:tc>
+          <w:tcPr>
+            <w:tcW w:type="dxa" w:w="2880"/>
+          </w:tcPr>
+          <w:p>
+            <w:r>
+              <w:t>Indicador</w:t>
+            </w:r>
+          </w:p>
+        </w:tc>
+        <w:tc>
+          <w:tcPr>
+            <w:tcW w:type="dxa" w:w="2880"/>
+          </w:tcPr>
+          <w:p>
+            <w:r>
+              <w:t>Cambio</w:t>
+            </w:r>
+          </w:p>
+        </w:tc>
+        <w:tc>
+          <w:tcPr>
+            <w:tcW w:type="dxa" w:w="2880"/>
+          </w:tcPr>
+          <w:p>
+            <w:r>
+              <w:t>IC 95 % del cambio</w:t>
+            </w:r>
+          </w:p>
+        </w:tc>
+      </w:tr>
+      <w:tr>
+        <w:tc>
+          <w:tcPr>
+            <w:tcW w:type="dxa" w:w="2880"/>
+          </w:tcPr>
+          <w:p>
+            <w:r>
+              <w:t>{%tr for r in seguimiento.deltas %}</w:t>
+            </w:r>
+          </w:p>
+        </w:tc>
+        <w:tc>
+          <w:tcPr>
+            <w:tcW w:type="dxa" w:w="2880"/>
+          </w:tcPr>
+          <w:p/>
+        </w:tc>
+        <w:tc>
+          <w:tcPr>
+            <w:tcW w:type="dxa" w:w="2880"/>
+          </w:tcPr>
+          <w:p/>
+        </w:tc>
+      </w:tr>
+      <w:tr>
+        <w:tc>
+          <w:tcPr>
+            <w:tcW w:type="dxa" w:w="2880"/>
+          </w:tcPr>
+          <w:p>
+            <w:r>
+              <w:t>{{ r.indicador }}</w:t>
+            </w:r>
+          </w:p>
+        </w:tc>
+        <w:tc>
+          <w:tcPr>
+            <w:tcW w:type="dxa" w:w="2880"/>
+          </w:tcPr>
+          <w:p>
+            <w:r>
+              <w:t>{{ r.cambio }}</w:t>
+            </w:r>
+          </w:p>
+        </w:tc>
+        <w:tc>
+          <w:tcPr>
+            <w:tcW w:type="dxa" w:w="2880"/>
+          </w:tcPr>
+          <w:p>
+            <w:r>
+              <w:t>{{ r.ic }}</w:t>
+            </w:r>
+          </w:p>
+        </w:tc>
+      </w:tr>
+      <w:tr>
+        <w:tc>
+          <w:tcPr>
+            <w:tcW w:type="dxa" w:w="2880"/>
+          </w:tcPr>
+          <w:p>
+            <w:r>
+              <w:t>{%tr endfor %}</w:t>
+            </w:r>
+          </w:p>
+        </w:tc>
+        <w:tc>
+          <w:tcPr>
+            <w:tcW w:type="dxa" w:w="2880"/>
+          </w:tcPr>
+          <w:p/>
+        </w:tc>
+        <w:tc>
+          <w:tcPr>
+            <w:tcW w:type="dxa" w:w="2880"/>
+          </w:tcPr>
+          <w:p/>
+        </w:tc>
+      </w:tr>
+    </w:tbl>
+    <w:p/>
+    <w:p>
+      <w:r>
+        <w:t>{%p endif %}</w:t>
+      </w:r>
+    </w:p>
+    <w:p>
+      <w:pPr>
+        <w:pStyle w:val="Heading2"/>
+      </w:pPr>
+      <w:r>
+        <w:t>Indicadores y cadencia de esta propuesta</w:t>
       </w:r>
     </w:p>
     <w:p>
@@ -3493,7 +6452,7 @@
         <w:pStyle w:val="Heading1"/>
       </w:pPr>
       <w:r>
-        <w:t>10. Riesgos y supuestos</w:t>
+        <w:t>12. Riesgos y supuestos</w:t>
       </w:r>
     </w:p>
     <w:tbl>
@@ -3593,7 +6552,7 @@
         <w:pStyle w:val="Heading1"/>
       </w:pPr>
       <w:r>
-        <w:t>11. Hoja de ruta y presupuesto</w:t>
+        <w:t>13. Hoja de ruta y presupuesto</w:t>
       </w:r>
     </w:p>
     <w:p>

</xml_diff>